<commit_message>
feat(paper): agrega confirmacion espacial y baseline acoplado
</commit_message>
<xml_diff>
--- a/entregables/material_suplementario.docx
+++ b/entregables/material_suplementario.docx
@@ -108,7 +108,7 @@
         <w:t xml:space="preserve"> </w:t>
       </w:r>
       <w:r>
-        <w:t xml:space="preserve">— Notes S1–S3, Tables S1–S17 and Figures S1–S3.</w:t>
+        <w:t xml:space="preserve">— Notes S1–S3, Tables S1–S19 and Figures S1–S3.</w:t>
       </w:r>
       <w:r>
         <w:br/>
@@ -278,13 +278,13 @@
           <w:b/>
           <w:bCs/>
         </w:rPr>
-        <w:t xml:space="preserve">Tables S1–S17:</w:t>
+        <w:t xml:space="preserve">Tables S1–S19:</w:t>
       </w:r>
       <w:r>
         <w:t xml:space="preserve"> </w:t>
       </w:r>
       <w:r>
-        <w:t xml:space="preserve">variable dictionary, hyperparameters, departmental results, computational profile, conformal coverage, population evaluation, paired significance, spatial blocks, lead time, sampling, full benchmark, ablation, M1 baseline, gated policy, SHAP, cost-loss and data audit.</w:t>
+        <w:t xml:space="preserve">variable dictionary, hyperparameters, departmental results, computational profile, conformal coverage, population evaluation, paired significance, spatial blocks, lead time, sampling, full benchmark, ablation, M1 baseline, gated policy, confirmation holdout, coupled baseline, SHAP, cost-loss and data audit.</w:t>
       </w:r>
     </w:p>
     <w:p>
@@ -12579,7 +12579,7 @@
         <w:pStyle w:val="BodyText"/>
       </w:pPr>
       <w:r>
-        <w:t xml:space="preserve">M1 = biophysical only; M2 = macro-anchor baseline; M3 = multiscale socio-ecological hybrid. Holdout = 50-km spatial block; Held-in = reference cells not excluded from training. The confirmation holdout is not used here.</w:t>
+        <w:t xml:space="preserve">M1 = biophysical only; M2 = macro-anchor baseline; M3 = multiscale socio-ecological hybrid. Holdout = 50-km spatial block; Held-in = reference cells not excluded from training. The confirmation holdout is evaluated separately in Table S18.</w:t>
       </w:r>
     </w:p>
     <w:p>
@@ -32939,6 +32939,1775 @@
       </w:pPr>
       <w:r>
         <w:t xml:space="preserve">Population-level metrics after prior correction: Chaco ROC-AUC 0.8081, PR-AUC 0.0009, precision 0.077 %, recall 30.873 %, F0.5 0.0010; Oriental ROC-AUC 0.7598, PR-AUC 0.0019, precision 0.210 %, recall 18.546 %, F0.5 0.0026. Cutoffs: Chaco 0.2218 sample / 0.000436 population; Oriental 0.2186 sample / 0.001158 population.</w:t>
+      </w:r>
+    </w:p>
+    <w:p>
+      <w:pPr>
+        <w:pStyle w:val="BodyText"/>
+      </w:pPr>
+      <w:r>
+        <w:rPr>
+          <w:b/>
+          <w:bCs/>
+        </w:rPr>
+        <w:t xml:space="preserve">Table S18.</w:t>
+      </w:r>
+      <w:r>
+        <w:t xml:space="preserve"> </w:t>
+      </w:r>
+      <w:r>
+        <w:t xml:space="preserve">Independent spatial confirmation holdout on 2023. Models were retrained excluding the 31 confirmation blocks and their 20-km buffer; the cutoff was selected on held-in 2023 cells and applied once to the confirmation cells.</w:t>
+      </w:r>
+    </w:p>
+    <w:tbl>
+      <w:tblPr>
+        <w:tblStyle w:val="Table"/>
+        <w:tblW w:type="pct" w:w="5000"/>
+        <w:tblLayout w:type="fixed"/>
+        <w:tblLook w:firstRow="1" w:lastRow="0" w:firstColumn="0" w:lastColumn="0" w:noHBand="0" w:noVBand="0" w:val="0020"/>
+      </w:tblPr>
+      <w:tblGrid>
+        <w:gridCol w:w="792"/>
+        <w:gridCol w:w="792"/>
+        <w:gridCol w:w="792"/>
+        <w:gridCol w:w="792"/>
+        <w:gridCol w:w="792"/>
+        <w:gridCol w:w="792"/>
+        <w:gridCol w:w="792"/>
+        <w:gridCol w:w="792"/>
+        <w:gridCol w:w="792"/>
+        <w:gridCol w:w="792"/>
+      </w:tblGrid>
+      <w:tr>
+        <w:trPr>
+          <w:tblHeader w:val="on"/>
+        </w:trPr>
+        <w:tc>
+          <w:tcPr/>
+          <w:p>
+            <w:pPr>
+              <w:pStyle w:val="Compact"/>
+              <w:jc w:val="left"/>
+            </w:pPr>
+            <w:r>
+              <w:t xml:space="preserve">Region</w:t>
+            </w:r>
+          </w:p>
+        </w:tc>
+        <w:tc>
+          <w:tcPr/>
+          <w:p>
+            <w:pPr>
+              <w:pStyle w:val="Compact"/>
+              <w:jc w:val="left"/>
+            </w:pPr>
+            <w:r>
+              <w:t xml:space="preserve">Model</w:t>
+            </w:r>
+          </w:p>
+        </w:tc>
+        <w:tc>
+          <w:tcPr/>
+          <w:p>
+            <w:pPr>
+              <w:pStyle w:val="Compact"/>
+              <w:jc w:val="left"/>
+            </w:pPr>
+            <w:r>
+              <w:t xml:space="preserve">Evaluation</w:t>
+            </w:r>
+          </w:p>
+        </w:tc>
+        <w:tc>
+          <w:tcPr/>
+          <w:p>
+            <w:pPr>
+              <w:pStyle w:val="Compact"/>
+              <w:jc w:val="right"/>
+            </w:pPr>
+            <w:r>
+              <w:t xml:space="preserve">n</w:t>
+            </w:r>
+          </w:p>
+        </w:tc>
+        <w:tc>
+          <w:tcPr/>
+          <w:p>
+            <w:pPr>
+              <w:pStyle w:val="Compact"/>
+              <w:jc w:val="right"/>
+            </w:pPr>
+            <w:r>
+              <w:t xml:space="preserve">Positives</w:t>
+            </w:r>
+          </w:p>
+        </w:tc>
+        <w:tc>
+          <w:tcPr/>
+          <w:p>
+            <w:pPr>
+              <w:pStyle w:val="Compact"/>
+              <w:jc w:val="right"/>
+            </w:pPr>
+            <w:r>
+              <w:t xml:space="preserve">ROC-AUC</w:t>
+            </w:r>
+          </w:p>
+        </w:tc>
+        <w:tc>
+          <w:tcPr/>
+          <w:p>
+            <w:pPr>
+              <w:pStyle w:val="Compact"/>
+              <w:jc w:val="right"/>
+            </w:pPr>
+            <w:r>
+              <w:t xml:space="preserve">PR-AUC</w:t>
+            </w:r>
+          </w:p>
+        </w:tc>
+        <w:tc>
+          <w:tcPr/>
+          <w:p>
+            <w:pPr>
+              <w:pStyle w:val="Compact"/>
+              <w:jc w:val="right"/>
+            </w:pPr>
+            <w:r>
+              <w:t xml:space="preserve">Precision</w:t>
+            </w:r>
+          </w:p>
+        </w:tc>
+        <w:tc>
+          <w:tcPr/>
+          <w:p>
+            <w:pPr>
+              <w:pStyle w:val="Compact"/>
+              <w:jc w:val="right"/>
+            </w:pPr>
+            <w:r>
+              <w:t xml:space="preserve">Recall</w:t>
+            </w:r>
+          </w:p>
+        </w:tc>
+        <w:tc>
+          <w:tcPr/>
+          <w:p>
+            <w:pPr>
+              <w:pStyle w:val="Compact"/>
+              <w:jc w:val="right"/>
+            </w:pPr>
+            <w:r>
+              <w:t xml:space="preserve">F0.5</w:t>
+            </w:r>
+          </w:p>
+        </w:tc>
+      </w:tr>
+      <w:tr>
+        <w:tc>
+          <w:tcPr/>
+          <w:p>
+            <w:pPr>
+              <w:pStyle w:val="Compact"/>
+              <w:jc w:val="left"/>
+            </w:pPr>
+            <w:r>
+              <w:t xml:space="preserve">Chaco</w:t>
+            </w:r>
+          </w:p>
+        </w:tc>
+        <w:tc>
+          <w:tcPr/>
+          <w:p>
+            <w:pPr>
+              <w:pStyle w:val="Compact"/>
+              <w:jc w:val="left"/>
+            </w:pPr>
+            <w:r>
+              <w:t xml:space="preserve">M1</w:t>
+            </w:r>
+          </w:p>
+        </w:tc>
+        <w:tc>
+          <w:tcPr/>
+          <w:p>
+            <w:pPr>
+              <w:pStyle w:val="Compact"/>
+              <w:jc w:val="left"/>
+            </w:pPr>
+            <w:r>
+              <w:t xml:space="preserve">Confirmation</w:t>
+            </w:r>
+          </w:p>
+        </w:tc>
+        <w:tc>
+          <w:tcPr/>
+          <w:p>
+            <w:pPr>
+              <w:pStyle w:val="Compact"/>
+              <w:jc w:val="right"/>
+            </w:pPr>
+            <w:r>
+              <w:t xml:space="preserve">16,579</w:t>
+            </w:r>
+          </w:p>
+        </w:tc>
+        <w:tc>
+          <w:tcPr/>
+          <w:p>
+            <w:pPr>
+              <w:pStyle w:val="Compact"/>
+              <w:jc w:val="right"/>
+            </w:pPr>
+            <w:r>
+              <w:t xml:space="preserve">1,404</w:t>
+            </w:r>
+          </w:p>
+        </w:tc>
+        <w:tc>
+          <w:tcPr/>
+          <w:p>
+            <w:pPr>
+              <w:pStyle w:val="Compact"/>
+              <w:jc w:val="right"/>
+            </w:pPr>
+            <w:r>
+              <w:t xml:space="preserve">0.6435</w:t>
+            </w:r>
+          </w:p>
+        </w:tc>
+        <w:tc>
+          <w:tcPr/>
+          <w:p>
+            <w:pPr>
+              <w:pStyle w:val="Compact"/>
+              <w:jc w:val="right"/>
+            </w:pPr>
+            <w:r>
+              <w:t xml:space="preserve">0.1263</w:t>
+            </w:r>
+          </w:p>
+        </w:tc>
+        <w:tc>
+          <w:tcPr/>
+          <w:p>
+            <w:pPr>
+              <w:pStyle w:val="Compact"/>
+              <w:jc w:val="right"/>
+            </w:pPr>
+            <w:r>
+              <w:t xml:space="preserve">14.57 %</w:t>
+            </w:r>
+          </w:p>
+        </w:tc>
+        <w:tc>
+          <w:tcPr/>
+          <w:p>
+            <w:pPr>
+              <w:pStyle w:val="Compact"/>
+              <w:jc w:val="right"/>
+            </w:pPr>
+            <w:r>
+              <w:t xml:space="preserve">9.26 %</w:t>
+            </w:r>
+          </w:p>
+        </w:tc>
+        <w:tc>
+          <w:tcPr/>
+          <w:p>
+            <w:pPr>
+              <w:pStyle w:val="Compact"/>
+              <w:jc w:val="right"/>
+            </w:pPr>
+            <w:r>
+              <w:t xml:space="preserve">0.1307</w:t>
+            </w:r>
+          </w:p>
+        </w:tc>
+      </w:tr>
+      <w:tr>
+        <w:tc>
+          <w:tcPr/>
+          <w:p>
+            <w:pPr>
+              <w:pStyle w:val="Compact"/>
+              <w:jc w:val="left"/>
+            </w:pPr>
+            <w:r>
+              <w:t xml:space="preserve">Chaco</w:t>
+            </w:r>
+          </w:p>
+        </w:tc>
+        <w:tc>
+          <w:tcPr/>
+          <w:p>
+            <w:pPr>
+              <w:pStyle w:val="Compact"/>
+              <w:jc w:val="left"/>
+            </w:pPr>
+            <w:r>
+              <w:t xml:space="preserve">M2</w:t>
+            </w:r>
+          </w:p>
+        </w:tc>
+        <w:tc>
+          <w:tcPr/>
+          <w:p>
+            <w:pPr>
+              <w:pStyle w:val="Compact"/>
+              <w:jc w:val="left"/>
+            </w:pPr>
+            <w:r>
+              <w:t xml:space="preserve">Confirmation</w:t>
+            </w:r>
+          </w:p>
+        </w:tc>
+        <w:tc>
+          <w:tcPr/>
+          <w:p>
+            <w:pPr>
+              <w:pStyle w:val="Compact"/>
+              <w:jc w:val="right"/>
+            </w:pPr>
+            <w:r>
+              <w:t xml:space="preserve">16,579</w:t>
+            </w:r>
+          </w:p>
+        </w:tc>
+        <w:tc>
+          <w:tcPr/>
+          <w:p>
+            <w:pPr>
+              <w:pStyle w:val="Compact"/>
+              <w:jc w:val="right"/>
+            </w:pPr>
+            <w:r>
+              <w:t xml:space="preserve">1,404</w:t>
+            </w:r>
+          </w:p>
+        </w:tc>
+        <w:tc>
+          <w:tcPr/>
+          <w:p>
+            <w:pPr>
+              <w:pStyle w:val="Compact"/>
+              <w:jc w:val="right"/>
+            </w:pPr>
+            <w:r>
+              <w:t xml:space="preserve">0.6871</w:t>
+            </w:r>
+          </w:p>
+        </w:tc>
+        <w:tc>
+          <w:tcPr/>
+          <w:p>
+            <w:pPr>
+              <w:pStyle w:val="Compact"/>
+              <w:jc w:val="right"/>
+            </w:pPr>
+            <w:r>
+              <w:t xml:space="preserve">0.1759</w:t>
+            </w:r>
+          </w:p>
+        </w:tc>
+        <w:tc>
+          <w:tcPr/>
+          <w:p>
+            <w:pPr>
+              <w:pStyle w:val="Compact"/>
+              <w:jc w:val="right"/>
+            </w:pPr>
+            <w:r>
+              <w:t xml:space="preserve">44.44 %</w:t>
+            </w:r>
+          </w:p>
+        </w:tc>
+        <w:tc>
+          <w:tcPr/>
+          <w:p>
+            <w:pPr>
+              <w:pStyle w:val="Compact"/>
+              <w:jc w:val="right"/>
+            </w:pPr>
+            <w:r>
+              <w:t xml:space="preserve">0.57 %</w:t>
+            </w:r>
+          </w:p>
+        </w:tc>
+        <w:tc>
+          <w:tcPr/>
+          <w:p>
+            <w:pPr>
+              <w:pStyle w:val="Compact"/>
+              <w:jc w:val="right"/>
+            </w:pPr>
+            <w:r>
+              <w:t xml:space="preserve">0.0271</w:t>
+            </w:r>
+          </w:p>
+        </w:tc>
+      </w:tr>
+      <w:tr>
+        <w:tc>
+          <w:tcPr/>
+          <w:p>
+            <w:pPr>
+              <w:pStyle w:val="Compact"/>
+              <w:jc w:val="left"/>
+            </w:pPr>
+            <w:r>
+              <w:t xml:space="preserve">Chaco</w:t>
+            </w:r>
+          </w:p>
+        </w:tc>
+        <w:tc>
+          <w:tcPr/>
+          <w:p>
+            <w:pPr>
+              <w:pStyle w:val="Compact"/>
+              <w:jc w:val="left"/>
+            </w:pPr>
+            <w:r>
+              <w:t xml:space="preserve">M3</w:t>
+            </w:r>
+          </w:p>
+        </w:tc>
+        <w:tc>
+          <w:tcPr/>
+          <w:p>
+            <w:pPr>
+              <w:pStyle w:val="Compact"/>
+              <w:jc w:val="left"/>
+            </w:pPr>
+            <w:r>
+              <w:t xml:space="preserve">Confirmation</w:t>
+            </w:r>
+          </w:p>
+        </w:tc>
+        <w:tc>
+          <w:tcPr/>
+          <w:p>
+            <w:pPr>
+              <w:pStyle w:val="Compact"/>
+              <w:jc w:val="right"/>
+            </w:pPr>
+            <w:r>
+              <w:t xml:space="preserve">16,579</w:t>
+            </w:r>
+          </w:p>
+        </w:tc>
+        <w:tc>
+          <w:tcPr/>
+          <w:p>
+            <w:pPr>
+              <w:pStyle w:val="Compact"/>
+              <w:jc w:val="right"/>
+            </w:pPr>
+            <w:r>
+              <w:t xml:space="preserve">1,404</w:t>
+            </w:r>
+          </w:p>
+        </w:tc>
+        <w:tc>
+          <w:tcPr/>
+          <w:p>
+            <w:pPr>
+              <w:pStyle w:val="Compact"/>
+              <w:jc w:val="right"/>
+            </w:pPr>
+            <w:r>
+              <w:t xml:space="preserve">0.6757</w:t>
+            </w:r>
+          </w:p>
+        </w:tc>
+        <w:tc>
+          <w:tcPr/>
+          <w:p>
+            <w:pPr>
+              <w:pStyle w:val="Compact"/>
+              <w:jc w:val="right"/>
+            </w:pPr>
+            <w:r>
+              <w:t xml:space="preserve">0.1663</w:t>
+            </w:r>
+          </w:p>
+        </w:tc>
+        <w:tc>
+          <w:tcPr/>
+          <w:p>
+            <w:pPr>
+              <w:pStyle w:val="Compact"/>
+              <w:jc w:val="right"/>
+            </w:pPr>
+            <w:r>
+              <w:t xml:space="preserve">60.00 %</w:t>
+            </w:r>
+          </w:p>
+        </w:tc>
+        <w:tc>
+          <w:tcPr/>
+          <w:p>
+            <w:pPr>
+              <w:pStyle w:val="Compact"/>
+              <w:jc w:val="right"/>
+            </w:pPr>
+            <w:r>
+              <w:t xml:space="preserve">0.43 %</w:t>
+            </w:r>
+          </w:p>
+        </w:tc>
+        <w:tc>
+          <w:tcPr/>
+          <w:p>
+            <w:pPr>
+              <w:pStyle w:val="Compact"/>
+              <w:jc w:val="right"/>
+            </w:pPr>
+            <w:r>
+              <w:t xml:space="preserve">0.0208</w:t>
+            </w:r>
+          </w:p>
+        </w:tc>
+      </w:tr>
+      <w:tr>
+        <w:tc>
+          <w:tcPr/>
+          <w:p>
+            <w:pPr>
+              <w:pStyle w:val="Compact"/>
+              <w:jc w:val="left"/>
+            </w:pPr>
+            <w:r>
+              <w:t xml:space="preserve">Chaco</w:t>
+            </w:r>
+          </w:p>
+        </w:tc>
+        <w:tc>
+          <w:tcPr/>
+          <w:p>
+            <w:pPr>
+              <w:pStyle w:val="Compact"/>
+              <w:jc w:val="left"/>
+            </w:pPr>
+            <w:r>
+              <w:t xml:space="preserve">M3/M2 gated</w:t>
+            </w:r>
+          </w:p>
+        </w:tc>
+        <w:tc>
+          <w:tcPr/>
+          <w:p>
+            <w:pPr>
+              <w:pStyle w:val="Compact"/>
+              <w:jc w:val="left"/>
+            </w:pPr>
+            <w:r>
+              <w:t xml:space="preserve">Confirmation</w:t>
+            </w:r>
+          </w:p>
+        </w:tc>
+        <w:tc>
+          <w:tcPr/>
+          <w:p>
+            <w:pPr>
+              <w:pStyle w:val="Compact"/>
+              <w:jc w:val="right"/>
+            </w:pPr>
+            <w:r>
+              <w:t xml:space="preserve">16,579</w:t>
+            </w:r>
+          </w:p>
+        </w:tc>
+        <w:tc>
+          <w:tcPr/>
+          <w:p>
+            <w:pPr>
+              <w:pStyle w:val="Compact"/>
+              <w:jc w:val="right"/>
+            </w:pPr>
+            <w:r>
+              <w:t xml:space="preserve">1,404</w:t>
+            </w:r>
+          </w:p>
+        </w:tc>
+        <w:tc>
+          <w:tcPr/>
+          <w:p>
+            <w:pPr>
+              <w:pStyle w:val="Compact"/>
+              <w:jc w:val="right"/>
+            </w:pPr>
+            <w:r>
+              <w:t xml:space="preserve">0.6871</w:t>
+            </w:r>
+          </w:p>
+        </w:tc>
+        <w:tc>
+          <w:tcPr/>
+          <w:p>
+            <w:pPr>
+              <w:pStyle w:val="Compact"/>
+              <w:jc w:val="right"/>
+            </w:pPr>
+            <w:r>
+              <w:t xml:space="preserve">0.1759</w:t>
+            </w:r>
+          </w:p>
+        </w:tc>
+        <w:tc>
+          <w:tcPr/>
+          <w:p>
+            <w:pPr>
+              <w:pStyle w:val="Compact"/>
+              <w:jc w:val="right"/>
+            </w:pPr>
+            <w:r>
+              <w:t xml:space="preserve">54.55 %</w:t>
+            </w:r>
+          </w:p>
+        </w:tc>
+        <w:tc>
+          <w:tcPr/>
+          <w:p>
+            <w:pPr>
+              <w:pStyle w:val="Compact"/>
+              <w:jc w:val="right"/>
+            </w:pPr>
+            <w:r>
+              <w:t xml:space="preserve">0.43 %</w:t>
+            </w:r>
+          </w:p>
+        </w:tc>
+        <w:tc>
+          <w:tcPr/>
+          <w:p>
+            <w:pPr>
+              <w:pStyle w:val="Compact"/>
+              <w:jc w:val="right"/>
+            </w:pPr>
+            <w:r>
+              <w:t xml:space="preserve">0.0207</w:t>
+            </w:r>
+          </w:p>
+        </w:tc>
+      </w:tr>
+      <w:tr>
+        <w:tc>
+          <w:tcPr/>
+          <w:p>
+            <w:pPr>
+              <w:pStyle w:val="Compact"/>
+              <w:jc w:val="left"/>
+            </w:pPr>
+            <w:r>
+              <w:t xml:space="preserve">Oriental</w:t>
+            </w:r>
+          </w:p>
+        </w:tc>
+        <w:tc>
+          <w:tcPr/>
+          <w:p>
+            <w:pPr>
+              <w:pStyle w:val="Compact"/>
+              <w:jc w:val="left"/>
+            </w:pPr>
+            <w:r>
+              <w:t xml:space="preserve">M1</w:t>
+            </w:r>
+          </w:p>
+        </w:tc>
+        <w:tc>
+          <w:tcPr/>
+          <w:p>
+            <w:pPr>
+              <w:pStyle w:val="Compact"/>
+              <w:jc w:val="left"/>
+            </w:pPr>
+            <w:r>
+              <w:t xml:space="preserve">Confirmation</w:t>
+            </w:r>
+          </w:p>
+        </w:tc>
+        <w:tc>
+          <w:tcPr/>
+          <w:p>
+            <w:pPr>
+              <w:pStyle w:val="Compact"/>
+              <w:jc w:val="right"/>
+            </w:pPr>
+            <w:r>
+              <w:t xml:space="preserve">14,551</w:t>
+            </w:r>
+          </w:p>
+        </w:tc>
+        <w:tc>
+          <w:tcPr/>
+          <w:p>
+            <w:pPr>
+              <w:pStyle w:val="Compact"/>
+              <w:jc w:val="right"/>
+            </w:pPr>
+            <w:r>
+              <w:t xml:space="preserve">1,615</w:t>
+            </w:r>
+          </w:p>
+        </w:tc>
+        <w:tc>
+          <w:tcPr/>
+          <w:p>
+            <w:pPr>
+              <w:pStyle w:val="Compact"/>
+              <w:jc w:val="right"/>
+            </w:pPr>
+            <w:r>
+              <w:t xml:space="preserve">0.6388</w:t>
+            </w:r>
+          </w:p>
+        </w:tc>
+        <w:tc>
+          <w:tcPr/>
+          <w:p>
+            <w:pPr>
+              <w:pStyle w:val="Compact"/>
+              <w:jc w:val="right"/>
+            </w:pPr>
+            <w:r>
+              <w:t xml:space="preserve">0.1735</w:t>
+            </w:r>
+          </w:p>
+        </w:tc>
+        <w:tc>
+          <w:tcPr/>
+          <w:p>
+            <w:pPr>
+              <w:pStyle w:val="Compact"/>
+              <w:jc w:val="right"/>
+            </w:pPr>
+            <w:r>
+              <w:t xml:space="preserve">20.48 %</w:t>
+            </w:r>
+          </w:p>
+        </w:tc>
+        <w:tc>
+          <w:tcPr/>
+          <w:p>
+            <w:pPr>
+              <w:pStyle w:val="Compact"/>
+              <w:jc w:val="right"/>
+            </w:pPr>
+            <w:r>
+              <w:t xml:space="preserve">25.57 %</w:t>
+            </w:r>
+          </w:p>
+        </w:tc>
+        <w:tc>
+          <w:tcPr/>
+          <w:p>
+            <w:pPr>
+              <w:pStyle w:val="Compact"/>
+              <w:jc w:val="right"/>
+            </w:pPr>
+            <w:r>
+              <w:t xml:space="preserve">0.2133</w:t>
+            </w:r>
+          </w:p>
+        </w:tc>
+      </w:tr>
+      <w:tr>
+        <w:tc>
+          <w:tcPr/>
+          <w:p>
+            <w:pPr>
+              <w:pStyle w:val="Compact"/>
+              <w:jc w:val="left"/>
+            </w:pPr>
+            <w:r>
+              <w:t xml:space="preserve">Oriental</w:t>
+            </w:r>
+          </w:p>
+        </w:tc>
+        <w:tc>
+          <w:tcPr/>
+          <w:p>
+            <w:pPr>
+              <w:pStyle w:val="Compact"/>
+              <w:jc w:val="left"/>
+            </w:pPr>
+            <w:r>
+              <w:t xml:space="preserve">M2</w:t>
+            </w:r>
+          </w:p>
+        </w:tc>
+        <w:tc>
+          <w:tcPr/>
+          <w:p>
+            <w:pPr>
+              <w:pStyle w:val="Compact"/>
+              <w:jc w:val="left"/>
+            </w:pPr>
+            <w:r>
+              <w:t xml:space="preserve">Confirmation</w:t>
+            </w:r>
+          </w:p>
+        </w:tc>
+        <w:tc>
+          <w:tcPr/>
+          <w:p>
+            <w:pPr>
+              <w:pStyle w:val="Compact"/>
+              <w:jc w:val="right"/>
+            </w:pPr>
+            <w:r>
+              <w:t xml:space="preserve">14,551</w:t>
+            </w:r>
+          </w:p>
+        </w:tc>
+        <w:tc>
+          <w:tcPr/>
+          <w:p>
+            <w:pPr>
+              <w:pStyle w:val="Compact"/>
+              <w:jc w:val="right"/>
+            </w:pPr>
+            <w:r>
+              <w:t xml:space="preserve">1,615</w:t>
+            </w:r>
+          </w:p>
+        </w:tc>
+        <w:tc>
+          <w:tcPr/>
+          <w:p>
+            <w:pPr>
+              <w:pStyle w:val="Compact"/>
+              <w:jc w:val="right"/>
+            </w:pPr>
+            <w:r>
+              <w:t xml:space="preserve">0.6621</w:t>
+            </w:r>
+          </w:p>
+        </w:tc>
+        <w:tc>
+          <w:tcPr/>
+          <w:p>
+            <w:pPr>
+              <w:pStyle w:val="Compact"/>
+              <w:jc w:val="right"/>
+            </w:pPr>
+            <w:r>
+              <w:t xml:space="preserve">0.1842</w:t>
+            </w:r>
+          </w:p>
+        </w:tc>
+        <w:tc>
+          <w:tcPr/>
+          <w:p>
+            <w:pPr>
+              <w:pStyle w:val="Compact"/>
+              <w:jc w:val="right"/>
+            </w:pPr>
+            <w:r>
+              <w:t xml:space="preserve">25.00 %</w:t>
+            </w:r>
+          </w:p>
+        </w:tc>
+        <w:tc>
+          <w:tcPr/>
+          <w:p>
+            <w:pPr>
+              <w:pStyle w:val="Compact"/>
+              <w:jc w:val="right"/>
+            </w:pPr>
+            <w:r>
+              <w:t xml:space="preserve">0.12 %</w:t>
+            </w:r>
+          </w:p>
+        </w:tc>
+        <w:tc>
+          <w:tcPr/>
+          <w:p>
+            <w:pPr>
+              <w:pStyle w:val="Compact"/>
+              <w:jc w:val="right"/>
+            </w:pPr>
+            <w:r>
+              <w:t xml:space="preserve">0.0061</w:t>
+            </w:r>
+          </w:p>
+        </w:tc>
+      </w:tr>
+      <w:tr>
+        <w:tc>
+          <w:tcPr/>
+          <w:p>
+            <w:pPr>
+              <w:pStyle w:val="Compact"/>
+              <w:jc w:val="left"/>
+            </w:pPr>
+            <w:r>
+              <w:t xml:space="preserve">Oriental</w:t>
+            </w:r>
+          </w:p>
+        </w:tc>
+        <w:tc>
+          <w:tcPr/>
+          <w:p>
+            <w:pPr>
+              <w:pStyle w:val="Compact"/>
+              <w:jc w:val="left"/>
+            </w:pPr>
+            <w:r>
+              <w:t xml:space="preserve">M3</w:t>
+            </w:r>
+          </w:p>
+        </w:tc>
+        <w:tc>
+          <w:tcPr/>
+          <w:p>
+            <w:pPr>
+              <w:pStyle w:val="Compact"/>
+              <w:jc w:val="left"/>
+            </w:pPr>
+            <w:r>
+              <w:t xml:space="preserve">Confirmation</w:t>
+            </w:r>
+          </w:p>
+        </w:tc>
+        <w:tc>
+          <w:tcPr/>
+          <w:p>
+            <w:pPr>
+              <w:pStyle w:val="Compact"/>
+              <w:jc w:val="right"/>
+            </w:pPr>
+            <w:r>
+              <w:t xml:space="preserve">14,551</w:t>
+            </w:r>
+          </w:p>
+        </w:tc>
+        <w:tc>
+          <w:tcPr/>
+          <w:p>
+            <w:pPr>
+              <w:pStyle w:val="Compact"/>
+              <w:jc w:val="right"/>
+            </w:pPr>
+            <w:r>
+              <w:t xml:space="preserve">1,615</w:t>
+            </w:r>
+          </w:p>
+        </w:tc>
+        <w:tc>
+          <w:tcPr/>
+          <w:p>
+            <w:pPr>
+              <w:pStyle w:val="Compact"/>
+              <w:jc w:val="right"/>
+            </w:pPr>
+            <w:r>
+              <w:t xml:space="preserve">0.6344</w:t>
+            </w:r>
+          </w:p>
+        </w:tc>
+        <w:tc>
+          <w:tcPr/>
+          <w:p>
+            <w:pPr>
+              <w:pStyle w:val="Compact"/>
+              <w:jc w:val="right"/>
+            </w:pPr>
+            <w:r>
+              <w:t xml:space="preserve">0.1700</w:t>
+            </w:r>
+          </w:p>
+        </w:tc>
+        <w:tc>
+          <w:tcPr/>
+          <w:p>
+            <w:pPr>
+              <w:pStyle w:val="Compact"/>
+              <w:jc w:val="right"/>
+            </w:pPr>
+            <w:r>
+              <w:t xml:space="preserve">50.00 %</w:t>
+            </w:r>
+          </w:p>
+        </w:tc>
+        <w:tc>
+          <w:tcPr/>
+          <w:p>
+            <w:pPr>
+              <w:pStyle w:val="Compact"/>
+              <w:jc w:val="right"/>
+            </w:pPr>
+            <w:r>
+              <w:t xml:space="preserve">0.06 %</w:t>
+            </w:r>
+          </w:p>
+        </w:tc>
+        <w:tc>
+          <w:tcPr/>
+          <w:p>
+            <w:pPr>
+              <w:pStyle w:val="Compact"/>
+              <w:jc w:val="right"/>
+            </w:pPr>
+            <w:r>
+              <w:t xml:space="preserve">0.0031</w:t>
+            </w:r>
+          </w:p>
+        </w:tc>
+      </w:tr>
+      <w:tr>
+        <w:tc>
+          <w:tcPr/>
+          <w:p>
+            <w:pPr>
+              <w:pStyle w:val="Compact"/>
+              <w:jc w:val="left"/>
+            </w:pPr>
+            <w:r>
+              <w:t xml:space="preserve">Oriental</w:t>
+            </w:r>
+          </w:p>
+        </w:tc>
+        <w:tc>
+          <w:tcPr/>
+          <w:p>
+            <w:pPr>
+              <w:pStyle w:val="Compact"/>
+              <w:jc w:val="left"/>
+            </w:pPr>
+            <w:r>
+              <w:t xml:space="preserve">M3/M2 gated</w:t>
+            </w:r>
+          </w:p>
+        </w:tc>
+        <w:tc>
+          <w:tcPr/>
+          <w:p>
+            <w:pPr>
+              <w:pStyle w:val="Compact"/>
+              <w:jc w:val="left"/>
+            </w:pPr>
+            <w:r>
+              <w:t xml:space="preserve">Confirmation</w:t>
+            </w:r>
+          </w:p>
+        </w:tc>
+        <w:tc>
+          <w:tcPr/>
+          <w:p>
+            <w:pPr>
+              <w:pStyle w:val="Compact"/>
+              <w:jc w:val="right"/>
+            </w:pPr>
+            <w:r>
+              <w:t xml:space="preserve">14,551</w:t>
+            </w:r>
+          </w:p>
+        </w:tc>
+        <w:tc>
+          <w:tcPr/>
+          <w:p>
+            <w:pPr>
+              <w:pStyle w:val="Compact"/>
+              <w:jc w:val="right"/>
+            </w:pPr>
+            <w:r>
+              <w:t xml:space="preserve">1,615</w:t>
+            </w:r>
+          </w:p>
+        </w:tc>
+        <w:tc>
+          <w:tcPr/>
+          <w:p>
+            <w:pPr>
+              <w:pStyle w:val="Compact"/>
+              <w:jc w:val="right"/>
+            </w:pPr>
+            <w:r>
+              <w:t xml:space="preserve">0.6621</w:t>
+            </w:r>
+          </w:p>
+        </w:tc>
+        <w:tc>
+          <w:tcPr/>
+          <w:p>
+            <w:pPr>
+              <w:pStyle w:val="Compact"/>
+              <w:jc w:val="right"/>
+            </w:pPr>
+            <w:r>
+              <w:t xml:space="preserve">0.1842</w:t>
+            </w:r>
+          </w:p>
+        </w:tc>
+        <w:tc>
+          <w:tcPr/>
+          <w:p>
+            <w:pPr>
+              <w:pStyle w:val="Compact"/>
+              <w:jc w:val="right"/>
+            </w:pPr>
+            <w:r>
+              <w:t xml:space="preserve">14.29 %</w:t>
+            </w:r>
+          </w:p>
+        </w:tc>
+        <w:tc>
+          <w:tcPr/>
+          <w:p>
+            <w:pPr>
+              <w:pStyle w:val="Compact"/>
+              <w:jc w:val="right"/>
+            </w:pPr>
+            <w:r>
+              <w:t xml:space="preserve">0.06 %</w:t>
+            </w:r>
+          </w:p>
+        </w:tc>
+        <w:tc>
+          <w:tcPr/>
+          <w:p>
+            <w:pPr>
+              <w:pStyle w:val="Compact"/>
+              <w:jc w:val="right"/>
+            </w:pPr>
+            <w:r>
+              <w:t xml:space="preserve">0.0030</w:t>
+            </w:r>
+          </w:p>
+        </w:tc>
+      </w:tr>
+    </w:tbl>
+    <w:p>
+      <w:pPr>
+        <w:pStyle w:val="BodyText"/>
+      </w:pPr>
+      <w:r>
+        <w:t xml:space="preserve">The held-in 2023 reference rows and full precision/recall/FP/FN counts are in</w:t>
+      </w:r>
+      <w:r>
+        <w:t xml:space="preserve"> </w:t>
+      </w:r>
+      <w:r>
+        <w:rPr>
+          <w:rStyle w:val="VerbatimChar"/>
+        </w:rPr>
+        <w:t xml:space="preserve">tablas/tablaS18_confirmacion_espacial_2023.csv</w:t>
+      </w:r>
+      <w:r>
+        <w:t xml:space="preserve">. The low recall at the frozen cutoff reflects the calibration shift between held-in and confirmation blocks; discrimination (ROC-AUC/PR-AUC) is the primary comparison.</w:t>
+      </w:r>
+    </w:p>
+    <w:p>
+      <w:pPr>
+        <w:pStyle w:val="BodyText"/>
+      </w:pPr>
+      <w:r>
+        <w:rPr>
+          <w:b/>
+          <w:bCs/>
+        </w:rPr>
+        <w:t xml:space="preserve">Table S19.</w:t>
+      </w:r>
+      <w:r>
+        <w:t xml:space="preserve"> </w:t>
+      </w:r>
+      <w:r>
+        <w:t xml:space="preserve">Coupled t-1 baseline versus the decoupled task architecture on the combined fire sample. The coupled baseline is a single binary fire-at-</w:t>
+      </w:r>
+      <w:r>
+        <w:rPr>
+          <w:rStyle w:val="VerbatimChar"/>
+        </w:rPr>
+        <w:t xml:space="preserve">t</w:t>
+      </w:r>
+      <w:r>
+        <w:t xml:space="preserve"> </w:t>
+      </w:r>
+      <w:r>
+        <w:t xml:space="preserve">model with the three causal t-1 fire features; the decoupled comparator uses M3 for ignition rows and the propagation model for propagation rows. Both use the same combined case-control test rows.</w:t>
+      </w:r>
+    </w:p>
+    <w:tbl>
+      <w:tblPr>
+        <w:tblStyle w:val="Table"/>
+        <w:tblW w:type="pct" w:w="5000"/>
+        <w:tblLayout w:type="fixed"/>
+        <w:tblLook w:firstRow="1" w:lastRow="0" w:firstColumn="0" w:lastColumn="0" w:noHBand="0" w:noVBand="0" w:val="0020"/>
+      </w:tblPr>
+      <w:tblGrid>
+        <w:gridCol w:w="879"/>
+        <w:gridCol w:w="879"/>
+        <w:gridCol w:w="879"/>
+        <w:gridCol w:w="879"/>
+        <w:gridCol w:w="879"/>
+        <w:gridCol w:w="879"/>
+        <w:gridCol w:w="879"/>
+        <w:gridCol w:w="879"/>
+        <w:gridCol w:w="879"/>
+      </w:tblGrid>
+      <w:tr>
+        <w:trPr>
+          <w:tblHeader w:val="on"/>
+        </w:trPr>
+        <w:tc>
+          <w:tcPr/>
+          <w:p>
+            <w:pPr>
+              <w:pStyle w:val="Compact"/>
+              <w:jc w:val="left"/>
+            </w:pPr>
+            <w:r>
+              <w:t xml:space="preserve">Region</w:t>
+            </w:r>
+          </w:p>
+        </w:tc>
+        <w:tc>
+          <w:tcPr/>
+          <w:p>
+            <w:pPr>
+              <w:pStyle w:val="Compact"/>
+              <w:jc w:val="left"/>
+            </w:pPr>
+            <w:r>
+              <w:t xml:space="preserve">Comparator</w:t>
+            </w:r>
+          </w:p>
+        </w:tc>
+        <w:tc>
+          <w:tcPr/>
+          <w:p>
+            <w:pPr>
+              <w:pStyle w:val="Compact"/>
+              <w:jc w:val="right"/>
+            </w:pPr>
+            <w:r>
+              <w:t xml:space="preserve">ROC-AUC</w:t>
+            </w:r>
+          </w:p>
+        </w:tc>
+        <w:tc>
+          <w:tcPr/>
+          <w:p>
+            <w:pPr>
+              <w:pStyle w:val="Compact"/>
+              <w:jc w:val="right"/>
+            </w:pPr>
+            <w:r>
+              <w:t xml:space="preserve">PR-AUC</w:t>
+            </w:r>
+          </w:p>
+        </w:tc>
+        <w:tc>
+          <w:tcPr/>
+          <w:p>
+            <w:pPr>
+              <w:pStyle w:val="Compact"/>
+              <w:jc w:val="right"/>
+            </w:pPr>
+            <w:r>
+              <w:t xml:space="preserve">Brier</w:t>
+            </w:r>
+          </w:p>
+        </w:tc>
+        <w:tc>
+          <w:tcPr/>
+          <w:p>
+            <w:pPr>
+              <w:pStyle w:val="Compact"/>
+              <w:jc w:val="right"/>
+            </w:pPr>
+            <w:r>
+              <w:t xml:space="preserve">BSS</w:t>
+            </w:r>
+          </w:p>
+        </w:tc>
+        <w:tc>
+          <w:tcPr/>
+          <w:p>
+            <w:pPr>
+              <w:pStyle w:val="Compact"/>
+              <w:jc w:val="right"/>
+            </w:pPr>
+            <w:r>
+              <w:t xml:space="preserve">ECE</w:t>
+            </w:r>
+          </w:p>
+        </w:tc>
+        <w:tc>
+          <w:tcPr/>
+          <w:p>
+            <w:pPr>
+              <w:pStyle w:val="Compact"/>
+              <w:jc w:val="right"/>
+            </w:pPr>
+            <w:r>
+              <w:t xml:space="preserve">n</w:t>
+            </w:r>
+          </w:p>
+        </w:tc>
+        <w:tc>
+          <w:tcPr/>
+          <w:p>
+            <w:pPr>
+              <w:pStyle w:val="Compact"/>
+              <w:jc w:val="right"/>
+            </w:pPr>
+            <w:r>
+              <w:t xml:space="preserve">Positives</w:t>
+            </w:r>
+          </w:p>
+        </w:tc>
+      </w:tr>
+      <w:tr>
+        <w:tc>
+          <w:tcPr/>
+          <w:p>
+            <w:pPr>
+              <w:pStyle w:val="Compact"/>
+              <w:jc w:val="left"/>
+            </w:pPr>
+            <w:r>
+              <w:t xml:space="preserve">Chaco</w:t>
+            </w:r>
+          </w:p>
+        </w:tc>
+        <w:tc>
+          <w:tcPr/>
+          <w:p>
+            <w:pPr>
+              <w:pStyle w:val="Compact"/>
+              <w:jc w:val="left"/>
+            </w:pPr>
+            <w:r>
+              <w:t xml:space="preserve">Coupled t-1</w:t>
+            </w:r>
+          </w:p>
+        </w:tc>
+        <w:tc>
+          <w:tcPr/>
+          <w:p>
+            <w:pPr>
+              <w:pStyle w:val="Compact"/>
+              <w:jc w:val="right"/>
+            </w:pPr>
+            <w:r>
+              <w:t xml:space="preserve">0.8862</w:t>
+            </w:r>
+          </w:p>
+        </w:tc>
+        <w:tc>
+          <w:tcPr/>
+          <w:p>
+            <w:pPr>
+              <w:pStyle w:val="Compact"/>
+              <w:jc w:val="right"/>
+            </w:pPr>
+            <w:r>
+              <w:t xml:space="preserve">0.6223</w:t>
+            </w:r>
+          </w:p>
+        </w:tc>
+        <w:tc>
+          <w:tcPr/>
+          <w:p>
+            <w:pPr>
+              <w:pStyle w:val="Compact"/>
+              <w:jc w:val="right"/>
+            </w:pPr>
+            <w:r>
+              <w:t xml:space="preserve">0.0513</w:t>
+            </w:r>
+          </w:p>
+        </w:tc>
+        <w:tc>
+          <w:tcPr/>
+          <w:p>
+            <w:pPr>
+              <w:pStyle w:val="Compact"/>
+              <w:jc w:val="right"/>
+            </w:pPr>
+            <w:r>
+              <w:t xml:space="preserve">0.3788</w:t>
+            </w:r>
+          </w:p>
+        </w:tc>
+        <w:tc>
+          <w:tcPr/>
+          <w:p>
+            <w:pPr>
+              <w:pStyle w:val="Compact"/>
+              <w:jc w:val="right"/>
+            </w:pPr>
+            <w:r>
+              <w:t xml:space="preserve">0.0091</w:t>
+            </w:r>
+          </w:p>
+        </w:tc>
+        <w:tc>
+          <w:tcPr/>
+          <w:p>
+            <w:pPr>
+              <w:pStyle w:val="Compact"/>
+              <w:jc w:val="right"/>
+            </w:pPr>
+            <w:r>
+              <w:t xml:space="preserve">753,071</w:t>
+            </w:r>
+          </w:p>
+        </w:tc>
+        <w:tc>
+          <w:tcPr/>
+          <w:p>
+            <w:pPr>
+              <w:pStyle w:val="Compact"/>
+              <w:jc w:val="right"/>
+            </w:pPr>
+            <w:r>
+              <w:t xml:space="preserve">68,461</w:t>
+            </w:r>
+          </w:p>
+        </w:tc>
+      </w:tr>
+      <w:tr>
+        <w:tc>
+          <w:tcPr/>
+          <w:p>
+            <w:pPr>
+              <w:pStyle w:val="Compact"/>
+              <w:jc w:val="left"/>
+            </w:pPr>
+            <w:r>
+              <w:t xml:space="preserve">Chaco</w:t>
+            </w:r>
+          </w:p>
+        </w:tc>
+        <w:tc>
+          <w:tcPr/>
+          <w:p>
+            <w:pPr>
+              <w:pStyle w:val="Compact"/>
+              <w:jc w:val="left"/>
+            </w:pPr>
+            <w:r>
+              <w:t xml:space="preserve">Decoupled task models</w:t>
+            </w:r>
+          </w:p>
+        </w:tc>
+        <w:tc>
+          <w:tcPr/>
+          <w:p>
+            <w:pPr>
+              <w:pStyle w:val="Compact"/>
+              <w:jc w:val="right"/>
+            </w:pPr>
+            <w:r>
+              <w:t xml:space="preserve">0.8868</w:t>
+            </w:r>
+          </w:p>
+        </w:tc>
+        <w:tc>
+          <w:tcPr/>
+          <w:p>
+            <w:pPr>
+              <w:pStyle w:val="Compact"/>
+              <w:jc w:val="right"/>
+            </w:pPr>
+            <w:r>
+              <w:t xml:space="preserve">0.6262</w:t>
+            </w:r>
+          </w:p>
+        </w:tc>
+        <w:tc>
+          <w:tcPr/>
+          <w:p>
+            <w:pPr>
+              <w:pStyle w:val="Compact"/>
+              <w:jc w:val="right"/>
+            </w:pPr>
+            <w:r>
+              <w:t xml:space="preserve">0.0510</w:t>
+            </w:r>
+          </w:p>
+        </w:tc>
+        <w:tc>
+          <w:tcPr/>
+          <w:p>
+            <w:pPr>
+              <w:pStyle w:val="Compact"/>
+              <w:jc w:val="right"/>
+            </w:pPr>
+            <w:r>
+              <w:t xml:space="preserve">0.3829</w:t>
+            </w:r>
+          </w:p>
+        </w:tc>
+        <w:tc>
+          <w:tcPr/>
+          <w:p>
+            <w:pPr>
+              <w:pStyle w:val="Compact"/>
+              <w:jc w:val="right"/>
+            </w:pPr>
+            <w:r>
+              <w:t xml:space="preserve">0.0084</w:t>
+            </w:r>
+          </w:p>
+        </w:tc>
+        <w:tc>
+          <w:tcPr/>
+          <w:p>
+            <w:pPr>
+              <w:pStyle w:val="Compact"/>
+              <w:jc w:val="right"/>
+            </w:pPr>
+            <w:r>
+              <w:t xml:space="preserve">753,071</w:t>
+            </w:r>
+          </w:p>
+        </w:tc>
+        <w:tc>
+          <w:tcPr/>
+          <w:p>
+            <w:pPr>
+              <w:pStyle w:val="Compact"/>
+              <w:jc w:val="right"/>
+            </w:pPr>
+            <w:r>
+              <w:t xml:space="preserve">68,461</w:t>
+            </w:r>
+          </w:p>
+        </w:tc>
+      </w:tr>
+      <w:tr>
+        <w:tc>
+          <w:tcPr/>
+          <w:p>
+            <w:pPr>
+              <w:pStyle w:val="Compact"/>
+              <w:jc w:val="left"/>
+            </w:pPr>
+            <w:r>
+              <w:t xml:space="preserve">Oriental</w:t>
+            </w:r>
+          </w:p>
+        </w:tc>
+        <w:tc>
+          <w:tcPr/>
+          <w:p>
+            <w:pPr>
+              <w:pStyle w:val="Compact"/>
+              <w:jc w:val="left"/>
+            </w:pPr>
+            <w:r>
+              <w:t xml:space="preserve">Coupled t-1</w:t>
+            </w:r>
+          </w:p>
+        </w:tc>
+        <w:tc>
+          <w:tcPr/>
+          <w:p>
+            <w:pPr>
+              <w:pStyle w:val="Compact"/>
+              <w:jc w:val="right"/>
+            </w:pPr>
+            <w:r>
+              <w:t xml:space="preserve">0.7871</w:t>
+            </w:r>
+          </w:p>
+        </w:tc>
+        <w:tc>
+          <w:tcPr/>
+          <w:p>
+            <w:pPr>
+              <w:pStyle w:val="Compact"/>
+              <w:jc w:val="right"/>
+            </w:pPr>
+            <w:r>
+              <w:t xml:space="preserve">0.3598</w:t>
+            </w:r>
+          </w:p>
+        </w:tc>
+        <w:tc>
+          <w:tcPr/>
+          <w:p>
+            <w:pPr>
+              <w:pStyle w:val="Compact"/>
+              <w:jc w:val="right"/>
+            </w:pPr>
+            <w:r>
+              <w:t xml:space="preserve">0.0701</w:t>
+            </w:r>
+          </w:p>
+        </w:tc>
+        <w:tc>
+          <w:tcPr/>
+          <w:p>
+            <w:pPr>
+              <w:pStyle w:val="Compact"/>
+              <w:jc w:val="right"/>
+            </w:pPr>
+            <w:r>
+              <w:t xml:space="preserve">0.1512</w:t>
+            </w:r>
+          </w:p>
+        </w:tc>
+        <w:tc>
+          <w:tcPr/>
+          <w:p>
+            <w:pPr>
+              <w:pStyle w:val="Compact"/>
+              <w:jc w:val="right"/>
+            </w:pPr>
+            <w:r>
+              <w:t xml:space="preserve">0.0089</w:t>
+            </w:r>
+          </w:p>
+        </w:tc>
+        <w:tc>
+          <w:tcPr/>
+          <w:p>
+            <w:pPr>
+              <w:pStyle w:val="Compact"/>
+              <w:jc w:val="right"/>
+            </w:pPr>
+            <w:r>
+              <w:t xml:space="preserve">1,060,895</w:t>
+            </w:r>
+          </w:p>
+        </w:tc>
+        <w:tc>
+          <w:tcPr/>
+          <w:p>
+            <w:pPr>
+              <w:pStyle w:val="Compact"/>
+              <w:jc w:val="right"/>
+            </w:pPr>
+            <w:r>
+              <w:t xml:space="preserve">96,445</w:t>
+            </w:r>
+          </w:p>
+        </w:tc>
+      </w:tr>
+      <w:tr>
+        <w:tc>
+          <w:tcPr/>
+          <w:p>
+            <w:pPr>
+              <w:pStyle w:val="Compact"/>
+              <w:jc w:val="left"/>
+            </w:pPr>
+            <w:r>
+              <w:t xml:space="preserve">Oriental</w:t>
+            </w:r>
+          </w:p>
+        </w:tc>
+        <w:tc>
+          <w:tcPr/>
+          <w:p>
+            <w:pPr>
+              <w:pStyle w:val="Compact"/>
+              <w:jc w:val="left"/>
+            </w:pPr>
+            <w:r>
+              <w:t xml:space="preserve">Decoupled task models</w:t>
+            </w:r>
+          </w:p>
+        </w:tc>
+        <w:tc>
+          <w:tcPr/>
+          <w:p>
+            <w:pPr>
+              <w:pStyle w:val="Compact"/>
+              <w:jc w:val="right"/>
+            </w:pPr>
+            <w:r>
+              <w:t xml:space="preserve">0.7806</w:t>
+            </w:r>
+          </w:p>
+        </w:tc>
+        <w:tc>
+          <w:tcPr/>
+          <w:p>
+            <w:pPr>
+              <w:pStyle w:val="Compact"/>
+              <w:jc w:val="right"/>
+            </w:pPr>
+            <w:r>
+              <w:t xml:space="preserve">0.3532</w:t>
+            </w:r>
+          </w:p>
+        </w:tc>
+        <w:tc>
+          <w:tcPr/>
+          <w:p>
+            <w:pPr>
+              <w:pStyle w:val="Compact"/>
+              <w:jc w:val="right"/>
+            </w:pPr>
+            <w:r>
+              <w:t xml:space="preserve">0.0705</w:t>
+            </w:r>
+          </w:p>
+        </w:tc>
+        <w:tc>
+          <w:tcPr/>
+          <w:p>
+            <w:pPr>
+              <w:pStyle w:val="Compact"/>
+              <w:jc w:val="right"/>
+            </w:pPr>
+            <w:r>
+              <w:t xml:space="preserve">0.1467</w:t>
+            </w:r>
+          </w:p>
+        </w:tc>
+        <w:tc>
+          <w:tcPr/>
+          <w:p>
+            <w:pPr>
+              <w:pStyle w:val="Compact"/>
+              <w:jc w:val="right"/>
+            </w:pPr>
+            <w:r>
+              <w:t xml:space="preserve">0.0090</w:t>
+            </w:r>
+          </w:p>
+        </w:tc>
+        <w:tc>
+          <w:tcPr/>
+          <w:p>
+            <w:pPr>
+              <w:pStyle w:val="Compact"/>
+              <w:jc w:val="right"/>
+            </w:pPr>
+            <w:r>
+              <w:t xml:space="preserve">1,060,895</w:t>
+            </w:r>
+          </w:p>
+        </w:tc>
+        <w:tc>
+          <w:tcPr/>
+          <w:p>
+            <w:pPr>
+              <w:pStyle w:val="Compact"/>
+              <w:jc w:val="right"/>
+            </w:pPr>
+            <w:r>
+              <w:t xml:space="preserve">96,445</w:t>
+            </w:r>
+          </w:p>
+        </w:tc>
+      </w:tr>
+    </w:tbl>
+    <w:p>
+      <w:pPr>
+        <w:pStyle w:val="BodyText"/>
+      </w:pPr>
+      <w:r>
+        <w:t xml:space="preserve">This is a comparator for the leakage discussion, not an operational model. Because both sides use the same gated case-control sample, it does not test the effect of removing the gate.</w:t>
       </w:r>
     </w:p>
     <w:bookmarkEnd w:id="24"/>

</xml_diff>

<commit_message>
feat(paper): agrega sensibilidad D2 con reentrenamiento
</commit_message>
<xml_diff>
--- a/entregables/material_suplementario.docx
+++ b/entregables/material_suplementario.docx
@@ -108,7 +108,7 @@
         <w:t xml:space="preserve"> </w:t>
       </w:r>
       <w:r>
-        <w:t xml:space="preserve">— Notes S1–S3, Tables S1–S19 and Figures S1–S3.</w:t>
+        <w:t xml:space="preserve">— Notes S1–S3, Tables S1–S20 and Figures S1–S3.</w:t>
       </w:r>
       <w:r>
         <w:br/>
@@ -278,13 +278,13 @@
           <w:b/>
           <w:bCs/>
         </w:rPr>
-        <w:t xml:space="preserve">Tables S1–S19:</w:t>
+        <w:t xml:space="preserve">Tables S1–S20:</w:t>
       </w:r>
       <w:r>
         <w:t xml:space="preserve"> </w:t>
       </w:r>
       <w:r>
-        <w:t xml:space="preserve">variable dictionary, hyperparameters, departmental results, computational profile, conformal coverage, population evaluation, paired significance, spatial blocks, lead time, sampling, full benchmark, ablation, M1 baseline, gated policy, confirmation holdout, coupled baseline, SHAP, cost-loss and data audit.</w:t>
+        <w:t xml:space="preserve">variable dictionary, hyperparameters, departmental results, computational profile, conformal coverage, population evaluation, paired significance, spatial blocks, lead time, sampling, full benchmark, ablation, M1 baseline, gated policy, confirmation holdout, coupled baseline, D2 sensitivity, SHAP, cost-loss and data audit.</w:t>
       </w:r>
     </w:p>
     <w:p>
@@ -34708,6 +34708,2614 @@
       </w:pPr>
       <w:r>
         <w:t xml:space="preserve">This is a comparator for the leakage discussion, not an operational model. Because both sides use the same gated case-control sample, it does not test the effect of removing the gate.</w:t>
+      </w:r>
+    </w:p>
+    <w:p>
+      <w:pPr>
+        <w:pStyle w:val="BodyText"/>
+      </w:pPr>
+      <w:r>
+        <w:rPr>
+          <w:b/>
+          <w:bCs/>
+        </w:rPr>
+        <w:t xml:space="preserve">Table S20.</w:t>
+      </w:r>
+      <w:r>
+        <w:t xml:space="preserve"> </w:t>
+      </w:r>
+      <w:r>
+        <w:t xml:space="preserve">D2 sensitivity with full retraining. Each row is an independent run: the 1:10 ignition sample was regenerated, M1/M2/M3 were retrained, the cutoff was selected on 2023 and applied to 2024–2025. Priors and predictors were held fixed; only the D2 radius and same-cell window changed. The 25 km/10 d row is the reference under this harness.</w:t>
+      </w:r>
+    </w:p>
+    <w:tbl>
+      <w:tblPr>
+        <w:tblStyle w:val="Table"/>
+        <w:tblW w:type="pct" w:w="5000"/>
+        <w:tblLayout w:type="fixed"/>
+        <w:tblLook w:firstRow="1" w:lastRow="0" w:firstColumn="0" w:lastColumn="0" w:noHBand="0" w:noVBand="0" w:val="0020"/>
+      </w:tblPr>
+      <w:tblGrid>
+        <w:gridCol w:w="719"/>
+        <w:gridCol w:w="719"/>
+        <w:gridCol w:w="719"/>
+        <w:gridCol w:w="719"/>
+        <w:gridCol w:w="719"/>
+        <w:gridCol w:w="719"/>
+        <w:gridCol w:w="719"/>
+        <w:gridCol w:w="719"/>
+        <w:gridCol w:w="719"/>
+        <w:gridCol w:w="719"/>
+        <w:gridCol w:w="719"/>
+      </w:tblGrid>
+      <w:tr>
+        <w:trPr>
+          <w:tblHeader w:val="on"/>
+        </w:trPr>
+        <w:tc>
+          <w:tcPr/>
+          <w:p>
+            <w:pPr>
+              <w:pStyle w:val="Compact"/>
+              <w:jc w:val="right"/>
+            </w:pPr>
+            <w:r>
+              <w:t xml:space="preserve">R (km)</w:t>
+            </w:r>
+          </w:p>
+        </w:tc>
+        <w:tc>
+          <w:tcPr/>
+          <w:p>
+            <w:pPr>
+              <w:pStyle w:val="Compact"/>
+              <w:jc w:val="right"/>
+            </w:pPr>
+            <w:r>
+              <w:t xml:space="preserve">W (d)</w:t>
+            </w:r>
+          </w:p>
+        </w:tc>
+        <w:tc>
+          <w:tcPr/>
+          <w:p>
+            <w:pPr>
+              <w:pStyle w:val="Compact"/>
+              <w:jc w:val="left"/>
+            </w:pPr>
+            <w:r>
+              <w:t xml:space="preserve">Region</w:t>
+            </w:r>
+          </w:p>
+        </w:tc>
+        <w:tc>
+          <w:tcPr/>
+          <w:p>
+            <w:pPr>
+              <w:pStyle w:val="Compact"/>
+              <w:jc w:val="right"/>
+            </w:pPr>
+            <w:r>
+              <w:t xml:space="preserve">n 2023</w:t>
+            </w:r>
+          </w:p>
+        </w:tc>
+        <w:tc>
+          <w:tcPr/>
+          <w:p>
+            <w:pPr>
+              <w:pStyle w:val="Compact"/>
+              <w:jc w:val="right"/>
+            </w:pPr>
+            <w:r>
+              <w:t xml:space="preserve">Pos 2023</w:t>
+            </w:r>
+          </w:p>
+        </w:tc>
+        <w:tc>
+          <w:tcPr/>
+          <w:p>
+            <w:pPr>
+              <w:pStyle w:val="Compact"/>
+              <w:jc w:val="right"/>
+            </w:pPr>
+            <w:r>
+              <w:t xml:space="preserve">ROC 2023</w:t>
+            </w:r>
+          </w:p>
+        </w:tc>
+        <w:tc>
+          <w:tcPr/>
+          <w:p>
+            <w:pPr>
+              <w:pStyle w:val="Compact"/>
+              <w:jc w:val="right"/>
+            </w:pPr>
+            <w:r>
+              <w:t xml:space="preserve">PR 2023</w:t>
+            </w:r>
+          </w:p>
+        </w:tc>
+        <w:tc>
+          <w:tcPr/>
+          <w:p>
+            <w:pPr>
+              <w:pStyle w:val="Compact"/>
+              <w:jc w:val="right"/>
+            </w:pPr>
+            <w:r>
+              <w:t xml:space="preserve">n 2024–25</w:t>
+            </w:r>
+          </w:p>
+        </w:tc>
+        <w:tc>
+          <w:tcPr/>
+          <w:p>
+            <w:pPr>
+              <w:pStyle w:val="Compact"/>
+              <w:jc w:val="right"/>
+            </w:pPr>
+            <w:r>
+              <w:t xml:space="preserve">Pos 2024–25</w:t>
+            </w:r>
+          </w:p>
+        </w:tc>
+        <w:tc>
+          <w:tcPr/>
+          <w:p>
+            <w:pPr>
+              <w:pStyle w:val="Compact"/>
+              <w:jc w:val="right"/>
+            </w:pPr>
+            <w:r>
+              <w:t xml:space="preserve">ROC 2024–25</w:t>
+            </w:r>
+          </w:p>
+        </w:tc>
+        <w:tc>
+          <w:tcPr/>
+          <w:p>
+            <w:pPr>
+              <w:pStyle w:val="Compact"/>
+              <w:jc w:val="right"/>
+            </w:pPr>
+            <w:r>
+              <w:t xml:space="preserve">PR 2024–25</w:t>
+            </w:r>
+          </w:p>
+        </w:tc>
+      </w:tr>
+      <w:tr>
+        <w:tc>
+          <w:tcPr/>
+          <w:p>
+            <w:pPr>
+              <w:pStyle w:val="Compact"/>
+              <w:jc w:val="right"/>
+            </w:pPr>
+            <w:r>
+              <w:t xml:space="preserve">15</w:t>
+            </w:r>
+          </w:p>
+        </w:tc>
+        <w:tc>
+          <w:tcPr/>
+          <w:p>
+            <w:pPr>
+              <w:pStyle w:val="Compact"/>
+              <w:jc w:val="right"/>
+            </w:pPr>
+            <w:r>
+              <w:t xml:space="preserve">7</w:t>
+            </w:r>
+          </w:p>
+        </w:tc>
+        <w:tc>
+          <w:tcPr/>
+          <w:p>
+            <w:pPr>
+              <w:pStyle w:val="Compact"/>
+              <w:jc w:val="left"/>
+            </w:pPr>
+            <w:r>
+              <w:t xml:space="preserve">Chaco</w:t>
+            </w:r>
+          </w:p>
+        </w:tc>
+        <w:tc>
+          <w:tcPr/>
+          <w:p>
+            <w:pPr>
+              <w:pStyle w:val="Compact"/>
+              <w:jc w:val="right"/>
+            </w:pPr>
+            <w:r>
+              <w:t xml:space="preserve">139,139</w:t>
+            </w:r>
+          </w:p>
+        </w:tc>
+        <w:tc>
+          <w:tcPr/>
+          <w:p>
+            <w:pPr>
+              <w:pStyle w:val="Compact"/>
+              <w:jc w:val="right"/>
+            </w:pPr>
+            <w:r>
+              <w:t xml:space="preserve">12,649</w:t>
+            </w:r>
+          </w:p>
+        </w:tc>
+        <w:tc>
+          <w:tcPr/>
+          <w:p>
+            <w:pPr>
+              <w:pStyle w:val="Compact"/>
+              <w:jc w:val="right"/>
+            </w:pPr>
+            <w:r>
+              <w:t xml:space="preserve">0.7824</w:t>
+            </w:r>
+          </w:p>
+        </w:tc>
+        <w:tc>
+          <w:tcPr/>
+          <w:p>
+            <w:pPr>
+              <w:pStyle w:val="Compact"/>
+              <w:jc w:val="right"/>
+            </w:pPr>
+            <w:r>
+              <w:t xml:space="preserve">0.2499</w:t>
+            </w:r>
+          </w:p>
+        </w:tc>
+        <w:tc>
+          <w:tcPr/>
+          <w:p>
+            <w:pPr>
+              <w:pStyle w:val="Compact"/>
+              <w:jc w:val="right"/>
+            </w:pPr>
+            <w:r>
+              <w:t xml:space="preserve">250,470</w:t>
+            </w:r>
+          </w:p>
+        </w:tc>
+        <w:tc>
+          <w:tcPr/>
+          <w:p>
+            <w:pPr>
+              <w:pStyle w:val="Compact"/>
+              <w:jc w:val="right"/>
+            </w:pPr>
+            <w:r>
+              <w:t xml:space="preserve">22,770</w:t>
+            </w:r>
+          </w:p>
+        </w:tc>
+        <w:tc>
+          <w:tcPr/>
+          <w:p>
+            <w:pPr>
+              <w:pStyle w:val="Compact"/>
+              <w:jc w:val="right"/>
+            </w:pPr>
+            <w:r>
+              <w:t xml:space="preserve">0.7893</w:t>
+            </w:r>
+          </w:p>
+        </w:tc>
+        <w:tc>
+          <w:tcPr/>
+          <w:p>
+            <w:pPr>
+              <w:pStyle w:val="Compact"/>
+              <w:jc w:val="right"/>
+            </w:pPr>
+            <w:r>
+              <w:t xml:space="preserve">0.2667</w:t>
+            </w:r>
+          </w:p>
+        </w:tc>
+      </w:tr>
+      <w:tr>
+        <w:tc>
+          <w:tcPr/>
+          <w:p>
+            <w:pPr>
+              <w:pStyle w:val="Compact"/>
+              <w:jc w:val="right"/>
+            </w:pPr>
+            <w:r>
+              <w:t xml:space="preserve">15</w:t>
+            </w:r>
+          </w:p>
+        </w:tc>
+        <w:tc>
+          <w:tcPr/>
+          <w:p>
+            <w:pPr>
+              <w:pStyle w:val="Compact"/>
+              <w:jc w:val="right"/>
+            </w:pPr>
+            <w:r>
+              <w:t xml:space="preserve">7</w:t>
+            </w:r>
+          </w:p>
+        </w:tc>
+        <w:tc>
+          <w:tcPr/>
+          <w:p>
+            <w:pPr>
+              <w:pStyle w:val="Compact"/>
+              <w:jc w:val="left"/>
+            </w:pPr>
+            <w:r>
+              <w:t xml:space="preserve">Oriental</w:t>
+            </w:r>
+          </w:p>
+        </w:tc>
+        <w:tc>
+          <w:tcPr/>
+          <w:p>
+            <w:pPr>
+              <w:pStyle w:val="Compact"/>
+              <w:jc w:val="right"/>
+            </w:pPr>
+            <w:r>
+              <w:t xml:space="preserve">168,630</w:t>
+            </w:r>
+          </w:p>
+        </w:tc>
+        <w:tc>
+          <w:tcPr/>
+          <w:p>
+            <w:pPr>
+              <w:pStyle w:val="Compact"/>
+              <w:jc w:val="right"/>
+            </w:pPr>
+            <w:r>
+              <w:t xml:space="preserve">15,330</w:t>
+            </w:r>
+          </w:p>
+        </w:tc>
+        <w:tc>
+          <w:tcPr/>
+          <w:p>
+            <w:pPr>
+              <w:pStyle w:val="Compact"/>
+              <w:jc w:val="right"/>
+            </w:pPr>
+            <w:r>
+              <w:t xml:space="preserve">0.7630</w:t>
+            </w:r>
+          </w:p>
+        </w:tc>
+        <w:tc>
+          <w:tcPr/>
+          <w:p>
+            <w:pPr>
+              <w:pStyle w:val="Compact"/>
+              <w:jc w:val="right"/>
+            </w:pPr>
+            <w:r>
+              <w:t xml:space="preserve">0.2491</w:t>
+            </w:r>
+          </w:p>
+        </w:tc>
+        <w:tc>
+          <w:tcPr/>
+          <w:p>
+            <w:pPr>
+              <w:pStyle w:val="Compact"/>
+              <w:jc w:val="right"/>
+            </w:pPr>
+            <w:r>
+              <w:t xml:space="preserve">358,952</w:t>
+            </w:r>
+          </w:p>
+        </w:tc>
+        <w:tc>
+          <w:tcPr/>
+          <w:p>
+            <w:pPr>
+              <w:pStyle w:val="Compact"/>
+              <w:jc w:val="right"/>
+            </w:pPr>
+            <w:r>
+              <w:t xml:space="preserve">32,632</w:t>
+            </w:r>
+          </w:p>
+        </w:tc>
+        <w:tc>
+          <w:tcPr/>
+          <w:p>
+            <w:pPr>
+              <w:pStyle w:val="Compact"/>
+              <w:jc w:val="right"/>
+            </w:pPr>
+            <w:r>
+              <w:t xml:space="preserve">0.7525</w:t>
+            </w:r>
+          </w:p>
+        </w:tc>
+        <w:tc>
+          <w:tcPr/>
+          <w:p>
+            <w:pPr>
+              <w:pStyle w:val="Compact"/>
+              <w:jc w:val="right"/>
+            </w:pPr>
+            <w:r>
+              <w:t xml:space="preserve">0.2384</w:t>
+            </w:r>
+          </w:p>
+        </w:tc>
+      </w:tr>
+      <w:tr>
+        <w:tc>
+          <w:tcPr/>
+          <w:p>
+            <w:pPr>
+              <w:pStyle w:val="Compact"/>
+              <w:jc w:val="right"/>
+            </w:pPr>
+            <w:r>
+              <w:t xml:space="preserve">15</w:t>
+            </w:r>
+          </w:p>
+        </w:tc>
+        <w:tc>
+          <w:tcPr/>
+          <w:p>
+            <w:pPr>
+              <w:pStyle w:val="Compact"/>
+              <w:jc w:val="right"/>
+            </w:pPr>
+            <w:r>
+              <w:t xml:space="preserve">10</w:t>
+            </w:r>
+          </w:p>
+        </w:tc>
+        <w:tc>
+          <w:tcPr/>
+          <w:p>
+            <w:pPr>
+              <w:pStyle w:val="Compact"/>
+              <w:jc w:val="left"/>
+            </w:pPr>
+            <w:r>
+              <w:t xml:space="preserve">Chaco</w:t>
+            </w:r>
+          </w:p>
+        </w:tc>
+        <w:tc>
+          <w:tcPr/>
+          <w:p>
+            <w:pPr>
+              <w:pStyle w:val="Compact"/>
+              <w:jc w:val="right"/>
+            </w:pPr>
+            <w:r>
+              <w:t xml:space="preserve">135,300</w:t>
+            </w:r>
+          </w:p>
+        </w:tc>
+        <w:tc>
+          <w:tcPr/>
+          <w:p>
+            <w:pPr>
+              <w:pStyle w:val="Compact"/>
+              <w:jc w:val="right"/>
+            </w:pPr>
+            <w:r>
+              <w:t xml:space="preserve">12,300</w:t>
+            </w:r>
+          </w:p>
+        </w:tc>
+        <w:tc>
+          <w:tcPr/>
+          <w:p>
+            <w:pPr>
+              <w:pStyle w:val="Compact"/>
+              <w:jc w:val="right"/>
+            </w:pPr>
+            <w:r>
+              <w:t xml:space="preserve">0.7803</w:t>
+            </w:r>
+          </w:p>
+        </w:tc>
+        <w:tc>
+          <w:tcPr/>
+          <w:p>
+            <w:pPr>
+              <w:pStyle w:val="Compact"/>
+              <w:jc w:val="right"/>
+            </w:pPr>
+            <w:r>
+              <w:t xml:space="preserve">0.2458</w:t>
+            </w:r>
+          </w:p>
+        </w:tc>
+        <w:tc>
+          <w:tcPr/>
+          <w:p>
+            <w:pPr>
+              <w:pStyle w:val="Compact"/>
+              <w:jc w:val="right"/>
+            </w:pPr>
+            <w:r>
+              <w:t xml:space="preserve">243,518</w:t>
+            </w:r>
+          </w:p>
+        </w:tc>
+        <w:tc>
+          <w:tcPr/>
+          <w:p>
+            <w:pPr>
+              <w:pStyle w:val="Compact"/>
+              <w:jc w:val="right"/>
+            </w:pPr>
+            <w:r>
+              <w:t xml:space="preserve">22,138</w:t>
+            </w:r>
+          </w:p>
+        </w:tc>
+        <w:tc>
+          <w:tcPr/>
+          <w:p>
+            <w:pPr>
+              <w:pStyle w:val="Compact"/>
+              <w:jc w:val="right"/>
+            </w:pPr>
+            <w:r>
+              <w:t xml:space="preserve">0.7877</w:t>
+            </w:r>
+          </w:p>
+        </w:tc>
+        <w:tc>
+          <w:tcPr/>
+          <w:p>
+            <w:pPr>
+              <w:pStyle w:val="Compact"/>
+              <w:jc w:val="right"/>
+            </w:pPr>
+            <w:r>
+              <w:t xml:space="preserve">0.2638</w:t>
+            </w:r>
+          </w:p>
+        </w:tc>
+      </w:tr>
+      <w:tr>
+        <w:tc>
+          <w:tcPr/>
+          <w:p>
+            <w:pPr>
+              <w:pStyle w:val="Compact"/>
+              <w:jc w:val="right"/>
+            </w:pPr>
+            <w:r>
+              <w:t xml:space="preserve">15</w:t>
+            </w:r>
+          </w:p>
+        </w:tc>
+        <w:tc>
+          <w:tcPr/>
+          <w:p>
+            <w:pPr>
+              <w:pStyle w:val="Compact"/>
+              <w:jc w:val="right"/>
+            </w:pPr>
+            <w:r>
+              <w:t xml:space="preserve">10</w:t>
+            </w:r>
+          </w:p>
+        </w:tc>
+        <w:tc>
+          <w:tcPr/>
+          <w:p>
+            <w:pPr>
+              <w:pStyle w:val="Compact"/>
+              <w:jc w:val="left"/>
+            </w:pPr>
+            <w:r>
+              <w:t xml:space="preserve">Oriental</w:t>
+            </w:r>
+          </w:p>
+        </w:tc>
+        <w:tc>
+          <w:tcPr/>
+          <w:p>
+            <w:pPr>
+              <w:pStyle w:val="Compact"/>
+              <w:jc w:val="right"/>
+            </w:pPr>
+            <w:r>
+              <w:t xml:space="preserve">165,891</w:t>
+            </w:r>
+          </w:p>
+        </w:tc>
+        <w:tc>
+          <w:tcPr/>
+          <w:p>
+            <w:pPr>
+              <w:pStyle w:val="Compact"/>
+              <w:jc w:val="right"/>
+            </w:pPr>
+            <w:r>
+              <w:t xml:space="preserve">15,081</w:t>
+            </w:r>
+          </w:p>
+        </w:tc>
+        <w:tc>
+          <w:tcPr/>
+          <w:p>
+            <w:pPr>
+              <w:pStyle w:val="Compact"/>
+              <w:jc w:val="right"/>
+            </w:pPr>
+            <w:r>
+              <w:t xml:space="preserve">0.7613</w:t>
+            </w:r>
+          </w:p>
+        </w:tc>
+        <w:tc>
+          <w:tcPr/>
+          <w:p>
+            <w:pPr>
+              <w:pStyle w:val="Compact"/>
+              <w:jc w:val="right"/>
+            </w:pPr>
+            <w:r>
+              <w:t xml:space="preserve">0.2464</w:t>
+            </w:r>
+          </w:p>
+        </w:tc>
+        <w:tc>
+          <w:tcPr/>
+          <w:p>
+            <w:pPr>
+              <w:pStyle w:val="Compact"/>
+              <w:jc w:val="right"/>
+            </w:pPr>
+            <w:r>
+              <w:t xml:space="preserve">353,650</w:t>
+            </w:r>
+          </w:p>
+        </w:tc>
+        <w:tc>
+          <w:tcPr/>
+          <w:p>
+            <w:pPr>
+              <w:pStyle w:val="Compact"/>
+              <w:jc w:val="right"/>
+            </w:pPr>
+            <w:r>
+              <w:t xml:space="preserve">32,150</w:t>
+            </w:r>
+          </w:p>
+        </w:tc>
+        <w:tc>
+          <w:tcPr/>
+          <w:p>
+            <w:pPr>
+              <w:pStyle w:val="Compact"/>
+              <w:jc w:val="right"/>
+            </w:pPr>
+            <w:r>
+              <w:t xml:space="preserve">0.7515</w:t>
+            </w:r>
+          </w:p>
+        </w:tc>
+        <w:tc>
+          <w:tcPr/>
+          <w:p>
+            <w:pPr>
+              <w:pStyle w:val="Compact"/>
+              <w:jc w:val="right"/>
+            </w:pPr>
+            <w:r>
+              <w:t xml:space="preserve">0.2341</w:t>
+            </w:r>
+          </w:p>
+        </w:tc>
+      </w:tr>
+      <w:tr>
+        <w:tc>
+          <w:tcPr/>
+          <w:p>
+            <w:pPr>
+              <w:pStyle w:val="Compact"/>
+              <w:jc w:val="right"/>
+            </w:pPr>
+            <w:r>
+              <w:t xml:space="preserve">15</w:t>
+            </w:r>
+          </w:p>
+        </w:tc>
+        <w:tc>
+          <w:tcPr/>
+          <w:p>
+            <w:pPr>
+              <w:pStyle w:val="Compact"/>
+              <w:jc w:val="right"/>
+            </w:pPr>
+            <w:r>
+              <w:t xml:space="preserve">14</w:t>
+            </w:r>
+          </w:p>
+        </w:tc>
+        <w:tc>
+          <w:tcPr/>
+          <w:p>
+            <w:pPr>
+              <w:pStyle w:val="Compact"/>
+              <w:jc w:val="left"/>
+            </w:pPr>
+            <w:r>
+              <w:t xml:space="preserve">Chaco</w:t>
+            </w:r>
+          </w:p>
+        </w:tc>
+        <w:tc>
+          <w:tcPr/>
+          <w:p>
+            <w:pPr>
+              <w:pStyle w:val="Compact"/>
+              <w:jc w:val="right"/>
+            </w:pPr>
+            <w:r>
+              <w:t xml:space="preserve">131,549</w:t>
+            </w:r>
+          </w:p>
+        </w:tc>
+        <w:tc>
+          <w:tcPr/>
+          <w:p>
+            <w:pPr>
+              <w:pStyle w:val="Compact"/>
+              <w:jc w:val="right"/>
+            </w:pPr>
+            <w:r>
+              <w:t xml:space="preserve">11,959</w:t>
+            </w:r>
+          </w:p>
+        </w:tc>
+        <w:tc>
+          <w:tcPr/>
+          <w:p>
+            <w:pPr>
+              <w:pStyle w:val="Compact"/>
+              <w:jc w:val="right"/>
+            </w:pPr>
+            <w:r>
+              <w:t xml:space="preserve">0.7774</w:t>
+            </w:r>
+          </w:p>
+        </w:tc>
+        <w:tc>
+          <w:tcPr/>
+          <w:p>
+            <w:pPr>
+              <w:pStyle w:val="Compact"/>
+              <w:jc w:val="right"/>
+            </w:pPr>
+            <w:r>
+              <w:t xml:space="preserve">0.2406</w:t>
+            </w:r>
+          </w:p>
+        </w:tc>
+        <w:tc>
+          <w:tcPr/>
+          <w:p>
+            <w:pPr>
+              <w:pStyle w:val="Compact"/>
+              <w:jc w:val="right"/>
+            </w:pPr>
+            <w:r>
+              <w:t xml:space="preserve">236,368</w:t>
+            </w:r>
+          </w:p>
+        </w:tc>
+        <w:tc>
+          <w:tcPr/>
+          <w:p>
+            <w:pPr>
+              <w:pStyle w:val="Compact"/>
+              <w:jc w:val="right"/>
+            </w:pPr>
+            <w:r>
+              <w:t xml:space="preserve">21,488</w:t>
+            </w:r>
+          </w:p>
+        </w:tc>
+        <w:tc>
+          <w:tcPr/>
+          <w:p>
+            <w:pPr>
+              <w:pStyle w:val="Compact"/>
+              <w:jc w:val="right"/>
+            </w:pPr>
+            <w:r>
+              <w:t xml:space="preserve">0.7854</w:t>
+            </w:r>
+          </w:p>
+        </w:tc>
+        <w:tc>
+          <w:tcPr/>
+          <w:p>
+            <w:pPr>
+              <w:pStyle w:val="Compact"/>
+              <w:jc w:val="right"/>
+            </w:pPr>
+            <w:r>
+              <w:t xml:space="preserve">0.2572</w:t>
+            </w:r>
+          </w:p>
+        </w:tc>
+      </w:tr>
+      <w:tr>
+        <w:tc>
+          <w:tcPr/>
+          <w:p>
+            <w:pPr>
+              <w:pStyle w:val="Compact"/>
+              <w:jc w:val="right"/>
+            </w:pPr>
+            <w:r>
+              <w:t xml:space="preserve">15</w:t>
+            </w:r>
+          </w:p>
+        </w:tc>
+        <w:tc>
+          <w:tcPr/>
+          <w:p>
+            <w:pPr>
+              <w:pStyle w:val="Compact"/>
+              <w:jc w:val="right"/>
+            </w:pPr>
+            <w:r>
+              <w:t xml:space="preserve">14</w:t>
+            </w:r>
+          </w:p>
+        </w:tc>
+        <w:tc>
+          <w:tcPr/>
+          <w:p>
+            <w:pPr>
+              <w:pStyle w:val="Compact"/>
+              <w:jc w:val="left"/>
+            </w:pPr>
+            <w:r>
+              <w:t xml:space="preserve">Oriental</w:t>
+            </w:r>
+          </w:p>
+        </w:tc>
+        <w:tc>
+          <w:tcPr/>
+          <w:p>
+            <w:pPr>
+              <w:pStyle w:val="Compact"/>
+              <w:jc w:val="right"/>
+            </w:pPr>
+            <w:r>
+              <w:t xml:space="preserve">162,569</w:t>
+            </w:r>
+          </w:p>
+        </w:tc>
+        <w:tc>
+          <w:tcPr/>
+          <w:p>
+            <w:pPr>
+              <w:pStyle w:val="Compact"/>
+              <w:jc w:val="right"/>
+            </w:pPr>
+            <w:r>
+              <w:t xml:space="preserve">14,779</w:t>
+            </w:r>
+          </w:p>
+        </w:tc>
+        <w:tc>
+          <w:tcPr/>
+          <w:p>
+            <w:pPr>
+              <w:pStyle w:val="Compact"/>
+              <w:jc w:val="right"/>
+            </w:pPr>
+            <w:r>
+              <w:t xml:space="preserve">0.7592</w:t>
+            </w:r>
+          </w:p>
+        </w:tc>
+        <w:tc>
+          <w:tcPr/>
+          <w:p>
+            <w:pPr>
+              <w:pStyle w:val="Compact"/>
+              <w:jc w:val="right"/>
+            </w:pPr>
+            <w:r>
+              <w:t xml:space="preserve">0.2402</w:t>
+            </w:r>
+          </w:p>
+        </w:tc>
+        <w:tc>
+          <w:tcPr/>
+          <w:p>
+            <w:pPr>
+              <w:pStyle w:val="Compact"/>
+              <w:jc w:val="right"/>
+            </w:pPr>
+            <w:r>
+              <w:t xml:space="preserve">347,204</w:t>
+            </w:r>
+          </w:p>
+        </w:tc>
+        <w:tc>
+          <w:tcPr/>
+          <w:p>
+            <w:pPr>
+              <w:pStyle w:val="Compact"/>
+              <w:jc w:val="right"/>
+            </w:pPr>
+            <w:r>
+              <w:t xml:space="preserve">31,564</w:t>
+            </w:r>
+          </w:p>
+        </w:tc>
+        <w:tc>
+          <w:tcPr/>
+          <w:p>
+            <w:pPr>
+              <w:pStyle w:val="Compact"/>
+              <w:jc w:val="right"/>
+            </w:pPr>
+            <w:r>
+              <w:t xml:space="preserve">0.7501</w:t>
+            </w:r>
+          </w:p>
+        </w:tc>
+        <w:tc>
+          <w:tcPr/>
+          <w:p>
+            <w:pPr>
+              <w:pStyle w:val="Compact"/>
+              <w:jc w:val="right"/>
+            </w:pPr>
+            <w:r>
+              <w:t xml:space="preserve">0.2312</w:t>
+            </w:r>
+          </w:p>
+        </w:tc>
+      </w:tr>
+      <w:tr>
+        <w:tc>
+          <w:tcPr/>
+          <w:p>
+            <w:pPr>
+              <w:pStyle w:val="Compact"/>
+              <w:jc w:val="right"/>
+            </w:pPr>
+            <w:r>
+              <w:t xml:space="preserve">25</w:t>
+            </w:r>
+          </w:p>
+        </w:tc>
+        <w:tc>
+          <w:tcPr/>
+          <w:p>
+            <w:pPr>
+              <w:pStyle w:val="Compact"/>
+              <w:jc w:val="right"/>
+            </w:pPr>
+            <w:r>
+              <w:t xml:space="preserve">7</w:t>
+            </w:r>
+          </w:p>
+        </w:tc>
+        <w:tc>
+          <w:tcPr/>
+          <w:p>
+            <w:pPr>
+              <w:pStyle w:val="Compact"/>
+              <w:jc w:val="left"/>
+            </w:pPr>
+            <w:r>
+              <w:t xml:space="preserve">Chaco</w:t>
+            </w:r>
+          </w:p>
+        </w:tc>
+        <w:tc>
+          <w:tcPr/>
+          <w:p>
+            <w:pPr>
+              <w:pStyle w:val="Compact"/>
+              <w:jc w:val="right"/>
+            </w:pPr>
+            <w:r>
+              <w:t xml:space="preserve">100,408</w:t>
+            </w:r>
+          </w:p>
+        </w:tc>
+        <w:tc>
+          <w:tcPr/>
+          <w:p>
+            <w:pPr>
+              <w:pStyle w:val="Compact"/>
+              <w:jc w:val="right"/>
+            </w:pPr>
+            <w:r>
+              <w:t xml:space="preserve">9,128</w:t>
+            </w:r>
+          </w:p>
+        </w:tc>
+        <w:tc>
+          <w:tcPr/>
+          <w:p>
+            <w:pPr>
+              <w:pStyle w:val="Compact"/>
+              <w:jc w:val="right"/>
+            </w:pPr>
+            <w:r>
+              <w:t xml:space="preserve">0.7783</w:t>
+            </w:r>
+          </w:p>
+        </w:tc>
+        <w:tc>
+          <w:tcPr/>
+          <w:p>
+            <w:pPr>
+              <w:pStyle w:val="Compact"/>
+              <w:jc w:val="right"/>
+            </w:pPr>
+            <w:r>
+              <w:t xml:space="preserve">0.2417</w:t>
+            </w:r>
+          </w:p>
+        </w:tc>
+        <w:tc>
+          <w:tcPr/>
+          <w:p>
+            <w:pPr>
+              <w:pStyle w:val="Compact"/>
+              <w:jc w:val="right"/>
+            </w:pPr>
+            <w:r>
+              <w:t xml:space="preserve">181,852</w:t>
+            </w:r>
+          </w:p>
+        </w:tc>
+        <w:tc>
+          <w:tcPr/>
+          <w:p>
+            <w:pPr>
+              <w:pStyle w:val="Compact"/>
+              <w:jc w:val="right"/>
+            </w:pPr>
+            <w:r>
+              <w:t xml:space="preserve">16,532</w:t>
+            </w:r>
+          </w:p>
+        </w:tc>
+        <w:tc>
+          <w:tcPr/>
+          <w:p>
+            <w:pPr>
+              <w:pStyle w:val="Compact"/>
+              <w:jc w:val="right"/>
+            </w:pPr>
+            <w:r>
+              <w:t xml:space="preserve">0.7933</w:t>
+            </w:r>
+          </w:p>
+        </w:tc>
+        <w:tc>
+          <w:tcPr/>
+          <w:p>
+            <w:pPr>
+              <w:pStyle w:val="Compact"/>
+              <w:jc w:val="right"/>
+            </w:pPr>
+            <w:r>
+              <w:t xml:space="preserve">0.2658</w:t>
+            </w:r>
+          </w:p>
+        </w:tc>
+      </w:tr>
+      <w:tr>
+        <w:tc>
+          <w:tcPr/>
+          <w:p>
+            <w:pPr>
+              <w:pStyle w:val="Compact"/>
+              <w:jc w:val="right"/>
+            </w:pPr>
+            <w:r>
+              <w:t xml:space="preserve">25</w:t>
+            </w:r>
+          </w:p>
+        </w:tc>
+        <w:tc>
+          <w:tcPr/>
+          <w:p>
+            <w:pPr>
+              <w:pStyle w:val="Compact"/>
+              <w:jc w:val="right"/>
+            </w:pPr>
+            <w:r>
+              <w:t xml:space="preserve">7</w:t>
+            </w:r>
+          </w:p>
+        </w:tc>
+        <w:tc>
+          <w:tcPr/>
+          <w:p>
+            <w:pPr>
+              <w:pStyle w:val="Compact"/>
+              <w:jc w:val="left"/>
+            </w:pPr>
+            <w:r>
+              <w:t xml:space="preserve">Oriental</w:t>
+            </w:r>
+          </w:p>
+        </w:tc>
+        <w:tc>
+          <w:tcPr/>
+          <w:p>
+            <w:pPr>
+              <w:pStyle w:val="Compact"/>
+              <w:jc w:val="right"/>
+            </w:pPr>
+            <w:r>
+              <w:t xml:space="preserve">92,884</w:t>
+            </w:r>
+          </w:p>
+        </w:tc>
+        <w:tc>
+          <w:tcPr/>
+          <w:p>
+            <w:pPr>
+              <w:pStyle w:val="Compact"/>
+              <w:jc w:val="right"/>
+            </w:pPr>
+            <w:r>
+              <w:t xml:space="preserve">8,444</w:t>
+            </w:r>
+          </w:p>
+        </w:tc>
+        <w:tc>
+          <w:tcPr/>
+          <w:p>
+            <w:pPr>
+              <w:pStyle w:val="Compact"/>
+              <w:jc w:val="right"/>
+            </w:pPr>
+            <w:r>
+              <w:t xml:space="preserve">0.7664</w:t>
+            </w:r>
+          </w:p>
+        </w:tc>
+        <w:tc>
+          <w:tcPr/>
+          <w:p>
+            <w:pPr>
+              <w:pStyle w:val="Compact"/>
+              <w:jc w:val="right"/>
+            </w:pPr>
+            <w:r>
+              <w:t xml:space="preserve">0.2555</w:t>
+            </w:r>
+          </w:p>
+        </w:tc>
+        <w:tc>
+          <w:tcPr/>
+          <w:p>
+            <w:pPr>
+              <w:pStyle w:val="Compact"/>
+              <w:jc w:val="right"/>
+            </w:pPr>
+            <w:r>
+              <w:t xml:space="preserve">202,928</w:t>
+            </w:r>
+          </w:p>
+        </w:tc>
+        <w:tc>
+          <w:tcPr/>
+          <w:p>
+            <w:pPr>
+              <w:pStyle w:val="Compact"/>
+              <w:jc w:val="right"/>
+            </w:pPr>
+            <w:r>
+              <w:t xml:space="preserve">18,448</w:t>
+            </w:r>
+          </w:p>
+        </w:tc>
+        <w:tc>
+          <w:tcPr/>
+          <w:p>
+            <w:pPr>
+              <w:pStyle w:val="Compact"/>
+              <w:jc w:val="right"/>
+            </w:pPr>
+            <w:r>
+              <w:t xml:space="preserve">0.7547</w:t>
+            </w:r>
+          </w:p>
+        </w:tc>
+        <w:tc>
+          <w:tcPr/>
+          <w:p>
+            <w:pPr>
+              <w:pStyle w:val="Compact"/>
+              <w:jc w:val="right"/>
+            </w:pPr>
+            <w:r>
+              <w:t xml:space="preserve">0.2420</w:t>
+            </w:r>
+          </w:p>
+        </w:tc>
+      </w:tr>
+      <w:tr>
+        <w:tc>
+          <w:tcPr/>
+          <w:p>
+            <w:pPr>
+              <w:pStyle w:val="Compact"/>
+              <w:jc w:val="right"/>
+            </w:pPr>
+            <w:r>
+              <w:t xml:space="preserve">25</w:t>
+            </w:r>
+          </w:p>
+        </w:tc>
+        <w:tc>
+          <w:tcPr/>
+          <w:p>
+            <w:pPr>
+              <w:pStyle w:val="Compact"/>
+              <w:jc w:val="right"/>
+            </w:pPr>
+            <w:r>
+              <w:t xml:space="preserve">10</w:t>
+            </w:r>
+          </w:p>
+        </w:tc>
+        <w:tc>
+          <w:tcPr/>
+          <w:p>
+            <w:pPr>
+              <w:pStyle w:val="Compact"/>
+              <w:jc w:val="left"/>
+            </w:pPr>
+            <w:r>
+              <w:t xml:space="preserve">Chaco</w:t>
+            </w:r>
+          </w:p>
+        </w:tc>
+        <w:tc>
+          <w:tcPr/>
+          <w:p>
+            <w:pPr>
+              <w:pStyle w:val="Compact"/>
+              <w:jc w:val="right"/>
+            </w:pPr>
+            <w:r>
+              <w:t xml:space="preserve">97,383</w:t>
+            </w:r>
+          </w:p>
+        </w:tc>
+        <w:tc>
+          <w:tcPr/>
+          <w:p>
+            <w:pPr>
+              <w:pStyle w:val="Compact"/>
+              <w:jc w:val="right"/>
+            </w:pPr>
+            <w:r>
+              <w:t xml:space="preserve">8,853</w:t>
+            </w:r>
+          </w:p>
+        </w:tc>
+        <w:tc>
+          <w:tcPr/>
+          <w:p>
+            <w:pPr>
+              <w:pStyle w:val="Compact"/>
+              <w:jc w:val="right"/>
+            </w:pPr>
+            <w:r>
+              <w:t xml:space="preserve">0.7763</w:t>
+            </w:r>
+          </w:p>
+        </w:tc>
+        <w:tc>
+          <w:tcPr/>
+          <w:p>
+            <w:pPr>
+              <w:pStyle w:val="Compact"/>
+              <w:jc w:val="right"/>
+            </w:pPr>
+            <w:r>
+              <w:t xml:space="preserve">0.2422</w:t>
+            </w:r>
+          </w:p>
+        </w:tc>
+        <w:tc>
+          <w:tcPr/>
+          <w:p>
+            <w:pPr>
+              <w:pStyle w:val="Compact"/>
+              <w:jc w:val="right"/>
+            </w:pPr>
+            <w:r>
+              <w:t xml:space="preserve">176,616</w:t>
+            </w:r>
+          </w:p>
+        </w:tc>
+        <w:tc>
+          <w:tcPr/>
+          <w:p>
+            <w:pPr>
+              <w:pStyle w:val="Compact"/>
+              <w:jc w:val="right"/>
+            </w:pPr>
+            <w:r>
+              <w:t xml:space="preserve">16,056</w:t>
+            </w:r>
+          </w:p>
+        </w:tc>
+        <w:tc>
+          <w:tcPr/>
+          <w:p>
+            <w:pPr>
+              <w:pStyle w:val="Compact"/>
+              <w:jc w:val="right"/>
+            </w:pPr>
+            <w:r>
+              <w:t xml:space="preserve">0.7923</w:t>
+            </w:r>
+          </w:p>
+        </w:tc>
+        <w:tc>
+          <w:tcPr/>
+          <w:p>
+            <w:pPr>
+              <w:pStyle w:val="Compact"/>
+              <w:jc w:val="right"/>
+            </w:pPr>
+            <w:r>
+              <w:t xml:space="preserve">0.2600</w:t>
+            </w:r>
+          </w:p>
+        </w:tc>
+      </w:tr>
+      <w:tr>
+        <w:tc>
+          <w:tcPr/>
+          <w:p>
+            <w:pPr>
+              <w:pStyle w:val="Compact"/>
+              <w:jc w:val="right"/>
+            </w:pPr>
+            <w:r>
+              <w:t xml:space="preserve">25</w:t>
+            </w:r>
+          </w:p>
+        </w:tc>
+        <w:tc>
+          <w:tcPr/>
+          <w:p>
+            <w:pPr>
+              <w:pStyle w:val="Compact"/>
+              <w:jc w:val="right"/>
+            </w:pPr>
+            <w:r>
+              <w:t xml:space="preserve">10</w:t>
+            </w:r>
+          </w:p>
+        </w:tc>
+        <w:tc>
+          <w:tcPr/>
+          <w:p>
+            <w:pPr>
+              <w:pStyle w:val="Compact"/>
+              <w:jc w:val="left"/>
+            </w:pPr>
+            <w:r>
+              <w:t xml:space="preserve">Oriental</w:t>
+            </w:r>
+          </w:p>
+        </w:tc>
+        <w:tc>
+          <w:tcPr/>
+          <w:p>
+            <w:pPr>
+              <w:pStyle w:val="Compact"/>
+              <w:jc w:val="right"/>
+            </w:pPr>
+            <w:r>
+              <w:t xml:space="preserve">91,124</w:t>
+            </w:r>
+          </w:p>
+        </w:tc>
+        <w:tc>
+          <w:tcPr/>
+          <w:p>
+            <w:pPr>
+              <w:pStyle w:val="Compact"/>
+              <w:jc w:val="right"/>
+            </w:pPr>
+            <w:r>
+              <w:t xml:space="preserve">8,284</w:t>
+            </w:r>
+          </w:p>
+        </w:tc>
+        <w:tc>
+          <w:tcPr/>
+          <w:p>
+            <w:pPr>
+              <w:pStyle w:val="Compact"/>
+              <w:jc w:val="right"/>
+            </w:pPr>
+            <w:r>
+              <w:t xml:space="preserve">0.7622</w:t>
+            </w:r>
+          </w:p>
+        </w:tc>
+        <w:tc>
+          <w:tcPr/>
+          <w:p>
+            <w:pPr>
+              <w:pStyle w:val="Compact"/>
+              <w:jc w:val="right"/>
+            </w:pPr>
+            <w:r>
+              <w:t xml:space="preserve">0.2433</w:t>
+            </w:r>
+          </w:p>
+        </w:tc>
+        <w:tc>
+          <w:tcPr/>
+          <w:p>
+            <w:pPr>
+              <w:pStyle w:val="Compact"/>
+              <w:jc w:val="right"/>
+            </w:pPr>
+            <w:r>
+              <w:t xml:space="preserve">199,936</w:t>
+            </w:r>
+          </w:p>
+        </w:tc>
+        <w:tc>
+          <w:tcPr/>
+          <w:p>
+            <w:pPr>
+              <w:pStyle w:val="Compact"/>
+              <w:jc w:val="right"/>
+            </w:pPr>
+            <w:r>
+              <w:t xml:space="preserve">18,176</w:t>
+            </w:r>
+          </w:p>
+        </w:tc>
+        <w:tc>
+          <w:tcPr/>
+          <w:p>
+            <w:pPr>
+              <w:pStyle w:val="Compact"/>
+              <w:jc w:val="right"/>
+            </w:pPr>
+            <w:r>
+              <w:t xml:space="preserve">0.7526</w:t>
+            </w:r>
+          </w:p>
+        </w:tc>
+        <w:tc>
+          <w:tcPr/>
+          <w:p>
+            <w:pPr>
+              <w:pStyle w:val="Compact"/>
+              <w:jc w:val="right"/>
+            </w:pPr>
+            <w:r>
+              <w:t xml:space="preserve">0.2360</w:t>
+            </w:r>
+          </w:p>
+        </w:tc>
+      </w:tr>
+      <w:tr>
+        <w:tc>
+          <w:tcPr/>
+          <w:p>
+            <w:pPr>
+              <w:pStyle w:val="Compact"/>
+              <w:jc w:val="right"/>
+            </w:pPr>
+            <w:r>
+              <w:t xml:space="preserve">25</w:t>
+            </w:r>
+          </w:p>
+        </w:tc>
+        <w:tc>
+          <w:tcPr/>
+          <w:p>
+            <w:pPr>
+              <w:pStyle w:val="Compact"/>
+              <w:jc w:val="right"/>
+            </w:pPr>
+            <w:r>
+              <w:t xml:space="preserve">14</w:t>
+            </w:r>
+          </w:p>
+        </w:tc>
+        <w:tc>
+          <w:tcPr/>
+          <w:p>
+            <w:pPr>
+              <w:pStyle w:val="Compact"/>
+              <w:jc w:val="left"/>
+            </w:pPr>
+            <w:r>
+              <w:t xml:space="preserve">Chaco</w:t>
+            </w:r>
+          </w:p>
+        </w:tc>
+        <w:tc>
+          <w:tcPr/>
+          <w:p>
+            <w:pPr>
+              <w:pStyle w:val="Compact"/>
+              <w:jc w:val="right"/>
+            </w:pPr>
+            <w:r>
+              <w:t xml:space="preserve">94,468</w:t>
+            </w:r>
+          </w:p>
+        </w:tc>
+        <w:tc>
+          <w:tcPr/>
+          <w:p>
+            <w:pPr>
+              <w:pStyle w:val="Compact"/>
+              <w:jc w:val="right"/>
+            </w:pPr>
+            <w:r>
+              <w:t xml:space="preserve">8,588</w:t>
+            </w:r>
+          </w:p>
+        </w:tc>
+        <w:tc>
+          <w:tcPr/>
+          <w:p>
+            <w:pPr>
+              <w:pStyle w:val="Compact"/>
+              <w:jc w:val="right"/>
+            </w:pPr>
+            <w:r>
+              <w:t xml:space="preserve">0.7735</w:t>
+            </w:r>
+          </w:p>
+        </w:tc>
+        <w:tc>
+          <w:tcPr/>
+          <w:p>
+            <w:pPr>
+              <w:pStyle w:val="Compact"/>
+              <w:jc w:val="right"/>
+            </w:pPr>
+            <w:r>
+              <w:t xml:space="preserve">0.2379</w:t>
+            </w:r>
+          </w:p>
+        </w:tc>
+        <w:tc>
+          <w:tcPr/>
+          <w:p>
+            <w:pPr>
+              <w:pStyle w:val="Compact"/>
+              <w:jc w:val="right"/>
+            </w:pPr>
+            <w:r>
+              <w:t xml:space="preserve">171,281</w:t>
+            </w:r>
+          </w:p>
+        </w:tc>
+        <w:tc>
+          <w:tcPr/>
+          <w:p>
+            <w:pPr>
+              <w:pStyle w:val="Compact"/>
+              <w:jc w:val="right"/>
+            </w:pPr>
+            <w:r>
+              <w:t xml:space="preserve">15,571</w:t>
+            </w:r>
+          </w:p>
+        </w:tc>
+        <w:tc>
+          <w:tcPr/>
+          <w:p>
+            <w:pPr>
+              <w:pStyle w:val="Compact"/>
+              <w:jc w:val="right"/>
+            </w:pPr>
+            <w:r>
+              <w:t xml:space="preserve">0.7906</w:t>
+            </w:r>
+          </w:p>
+        </w:tc>
+        <w:tc>
+          <w:tcPr/>
+          <w:p>
+            <w:pPr>
+              <w:pStyle w:val="Compact"/>
+              <w:jc w:val="right"/>
+            </w:pPr>
+            <w:r>
+              <w:t xml:space="preserve">0.2550</w:t>
+            </w:r>
+          </w:p>
+        </w:tc>
+      </w:tr>
+      <w:tr>
+        <w:tc>
+          <w:tcPr/>
+          <w:p>
+            <w:pPr>
+              <w:pStyle w:val="Compact"/>
+              <w:jc w:val="right"/>
+            </w:pPr>
+            <w:r>
+              <w:t xml:space="preserve">25</w:t>
+            </w:r>
+          </w:p>
+        </w:tc>
+        <w:tc>
+          <w:tcPr/>
+          <w:p>
+            <w:pPr>
+              <w:pStyle w:val="Compact"/>
+              <w:jc w:val="right"/>
+            </w:pPr>
+            <w:r>
+              <w:t xml:space="preserve">14</w:t>
+            </w:r>
+          </w:p>
+        </w:tc>
+        <w:tc>
+          <w:tcPr/>
+          <w:p>
+            <w:pPr>
+              <w:pStyle w:val="Compact"/>
+              <w:jc w:val="left"/>
+            </w:pPr>
+            <w:r>
+              <w:t xml:space="preserve">Oriental</w:t>
+            </w:r>
+          </w:p>
+        </w:tc>
+        <w:tc>
+          <w:tcPr/>
+          <w:p>
+            <w:pPr>
+              <w:pStyle w:val="Compact"/>
+              <w:jc w:val="right"/>
+            </w:pPr>
+            <w:r>
+              <w:t xml:space="preserve">89,430</w:t>
+            </w:r>
+          </w:p>
+        </w:tc>
+        <w:tc>
+          <w:tcPr/>
+          <w:p>
+            <w:pPr>
+              <w:pStyle w:val="Compact"/>
+              <w:jc w:val="right"/>
+            </w:pPr>
+            <w:r>
+              <w:t xml:space="preserve">8,130</w:t>
+            </w:r>
+          </w:p>
+        </w:tc>
+        <w:tc>
+          <w:tcPr/>
+          <w:p>
+            <w:pPr>
+              <w:pStyle w:val="Compact"/>
+              <w:jc w:val="right"/>
+            </w:pPr>
+            <w:r>
+              <w:t xml:space="preserve">0.7608</w:t>
+            </w:r>
+          </w:p>
+        </w:tc>
+        <w:tc>
+          <w:tcPr/>
+          <w:p>
+            <w:pPr>
+              <w:pStyle w:val="Compact"/>
+              <w:jc w:val="right"/>
+            </w:pPr>
+            <w:r>
+              <w:t xml:space="preserve">0.2410</w:t>
+            </w:r>
+          </w:p>
+        </w:tc>
+        <w:tc>
+          <w:tcPr/>
+          <w:p>
+            <w:pPr>
+              <w:pStyle w:val="Compact"/>
+              <w:jc w:val="right"/>
+            </w:pPr>
+            <w:r>
+              <w:t xml:space="preserve">196,053</w:t>
+            </w:r>
+          </w:p>
+        </w:tc>
+        <w:tc>
+          <w:tcPr/>
+          <w:p>
+            <w:pPr>
+              <w:pStyle w:val="Compact"/>
+              <w:jc w:val="right"/>
+            </w:pPr>
+            <w:r>
+              <w:t xml:space="preserve">17,823</w:t>
+            </w:r>
+          </w:p>
+        </w:tc>
+        <w:tc>
+          <w:tcPr/>
+          <w:p>
+            <w:pPr>
+              <w:pStyle w:val="Compact"/>
+              <w:jc w:val="right"/>
+            </w:pPr>
+            <w:r>
+              <w:t xml:space="preserve">0.7505</w:t>
+            </w:r>
+          </w:p>
+        </w:tc>
+        <w:tc>
+          <w:tcPr/>
+          <w:p>
+            <w:pPr>
+              <w:pStyle w:val="Compact"/>
+              <w:jc w:val="right"/>
+            </w:pPr>
+            <w:r>
+              <w:t xml:space="preserve">0.2317</w:t>
+            </w:r>
+          </w:p>
+        </w:tc>
+      </w:tr>
+      <w:tr>
+        <w:tc>
+          <w:tcPr/>
+          <w:p>
+            <w:pPr>
+              <w:pStyle w:val="Compact"/>
+              <w:jc w:val="right"/>
+            </w:pPr>
+            <w:r>
+              <w:t xml:space="preserve">35</w:t>
+            </w:r>
+          </w:p>
+        </w:tc>
+        <w:tc>
+          <w:tcPr/>
+          <w:p>
+            <w:pPr>
+              <w:pStyle w:val="Compact"/>
+              <w:jc w:val="right"/>
+            </w:pPr>
+            <w:r>
+              <w:t xml:space="preserve">7</w:t>
+            </w:r>
+          </w:p>
+        </w:tc>
+        <w:tc>
+          <w:tcPr/>
+          <w:p>
+            <w:pPr>
+              <w:pStyle w:val="Compact"/>
+              <w:jc w:val="left"/>
+            </w:pPr>
+            <w:r>
+              <w:t xml:space="preserve">Chaco</w:t>
+            </w:r>
+          </w:p>
+        </w:tc>
+        <w:tc>
+          <w:tcPr/>
+          <w:p>
+            <w:pPr>
+              <w:pStyle w:val="Compact"/>
+              <w:jc w:val="right"/>
+            </w:pPr>
+            <w:r>
+              <w:t xml:space="preserve">73,051</w:t>
+            </w:r>
+          </w:p>
+        </w:tc>
+        <w:tc>
+          <w:tcPr/>
+          <w:p>
+            <w:pPr>
+              <w:pStyle w:val="Compact"/>
+              <w:jc w:val="right"/>
+            </w:pPr>
+            <w:r>
+              <w:t xml:space="preserve">6,641</w:t>
+            </w:r>
+          </w:p>
+        </w:tc>
+        <w:tc>
+          <w:tcPr/>
+          <w:p>
+            <w:pPr>
+              <w:pStyle w:val="Compact"/>
+              <w:jc w:val="right"/>
+            </w:pPr>
+            <w:r>
+              <w:t xml:space="preserve">0.7764</w:t>
+            </w:r>
+          </w:p>
+        </w:tc>
+        <w:tc>
+          <w:tcPr/>
+          <w:p>
+            <w:pPr>
+              <w:pStyle w:val="Compact"/>
+              <w:jc w:val="right"/>
+            </w:pPr>
+            <w:r>
+              <w:t xml:space="preserve">0.2428</w:t>
+            </w:r>
+          </w:p>
+        </w:tc>
+        <w:tc>
+          <w:tcPr/>
+          <w:p>
+            <w:pPr>
+              <w:pStyle w:val="Compact"/>
+              <w:jc w:val="right"/>
+            </w:pPr>
+            <w:r>
+              <w:t xml:space="preserve">130,449</w:t>
+            </w:r>
+          </w:p>
+        </w:tc>
+        <w:tc>
+          <w:tcPr/>
+          <w:p>
+            <w:pPr>
+              <w:pStyle w:val="Compact"/>
+              <w:jc w:val="right"/>
+            </w:pPr>
+            <w:r>
+              <w:t xml:space="preserve">11,859</w:t>
+            </w:r>
+          </w:p>
+        </w:tc>
+        <w:tc>
+          <w:tcPr/>
+          <w:p>
+            <w:pPr>
+              <w:pStyle w:val="Compact"/>
+              <w:jc w:val="right"/>
+            </w:pPr>
+            <w:r>
+              <w:t xml:space="preserve">0.7974</w:t>
+            </w:r>
+          </w:p>
+        </w:tc>
+        <w:tc>
+          <w:tcPr/>
+          <w:p>
+            <w:pPr>
+              <w:pStyle w:val="Compact"/>
+              <w:jc w:val="right"/>
+            </w:pPr>
+            <w:r>
+              <w:t xml:space="preserve">0.2672</w:t>
+            </w:r>
+          </w:p>
+        </w:tc>
+      </w:tr>
+      <w:tr>
+        <w:tc>
+          <w:tcPr/>
+          <w:p>
+            <w:pPr>
+              <w:pStyle w:val="Compact"/>
+              <w:jc w:val="right"/>
+            </w:pPr>
+            <w:r>
+              <w:t xml:space="preserve">35</w:t>
+            </w:r>
+          </w:p>
+        </w:tc>
+        <w:tc>
+          <w:tcPr/>
+          <w:p>
+            <w:pPr>
+              <w:pStyle w:val="Compact"/>
+              <w:jc w:val="right"/>
+            </w:pPr>
+            <w:r>
+              <w:t xml:space="preserve">7</w:t>
+            </w:r>
+          </w:p>
+        </w:tc>
+        <w:tc>
+          <w:tcPr/>
+          <w:p>
+            <w:pPr>
+              <w:pStyle w:val="Compact"/>
+              <w:jc w:val="left"/>
+            </w:pPr>
+            <w:r>
+              <w:t xml:space="preserve">Oriental</w:t>
+            </w:r>
+          </w:p>
+        </w:tc>
+        <w:tc>
+          <w:tcPr/>
+          <w:p>
+            <w:pPr>
+              <w:pStyle w:val="Compact"/>
+              <w:jc w:val="right"/>
+            </w:pPr>
+            <w:r>
+              <w:t xml:space="preserve">59,488</w:t>
+            </w:r>
+          </w:p>
+        </w:tc>
+        <w:tc>
+          <w:tcPr/>
+          <w:p>
+            <w:pPr>
+              <w:pStyle w:val="Compact"/>
+              <w:jc w:val="right"/>
+            </w:pPr>
+            <w:r>
+              <w:t xml:space="preserve">5,408</w:t>
+            </w:r>
+          </w:p>
+        </w:tc>
+        <w:tc>
+          <w:tcPr/>
+          <w:p>
+            <w:pPr>
+              <w:pStyle w:val="Compact"/>
+              <w:jc w:val="right"/>
+            </w:pPr>
+            <w:r>
+              <w:t xml:space="preserve">0.7676</w:t>
+            </w:r>
+          </w:p>
+        </w:tc>
+        <w:tc>
+          <w:tcPr/>
+          <w:p>
+            <w:pPr>
+              <w:pStyle w:val="Compact"/>
+              <w:jc w:val="right"/>
+            </w:pPr>
+            <w:r>
+              <w:t xml:space="preserve">0.2513</w:t>
+            </w:r>
+          </w:p>
+        </w:tc>
+        <w:tc>
+          <w:tcPr/>
+          <w:p>
+            <w:pPr>
+              <w:pStyle w:val="Compact"/>
+              <w:jc w:val="right"/>
+            </w:pPr>
+            <w:r>
+              <w:t xml:space="preserve">127,446</w:t>
+            </w:r>
+          </w:p>
+        </w:tc>
+        <w:tc>
+          <w:tcPr/>
+          <w:p>
+            <w:pPr>
+              <w:pStyle w:val="Compact"/>
+              <w:jc w:val="right"/>
+            </w:pPr>
+            <w:r>
+              <w:t xml:space="preserve">11,586</w:t>
+            </w:r>
+          </w:p>
+        </w:tc>
+        <w:tc>
+          <w:tcPr/>
+          <w:p>
+            <w:pPr>
+              <w:pStyle w:val="Compact"/>
+              <w:jc w:val="right"/>
+            </w:pPr>
+            <w:r>
+              <w:t xml:space="preserve">0.7531</w:t>
+            </w:r>
+          </w:p>
+        </w:tc>
+        <w:tc>
+          <w:tcPr/>
+          <w:p>
+            <w:pPr>
+              <w:pStyle w:val="Compact"/>
+              <w:jc w:val="right"/>
+            </w:pPr>
+            <w:r>
+              <w:t xml:space="preserve">0.2447</w:t>
+            </w:r>
+          </w:p>
+        </w:tc>
+      </w:tr>
+      <w:tr>
+        <w:tc>
+          <w:tcPr/>
+          <w:p>
+            <w:pPr>
+              <w:pStyle w:val="Compact"/>
+              <w:jc w:val="right"/>
+            </w:pPr>
+            <w:r>
+              <w:t xml:space="preserve">35</w:t>
+            </w:r>
+          </w:p>
+        </w:tc>
+        <w:tc>
+          <w:tcPr/>
+          <w:p>
+            <w:pPr>
+              <w:pStyle w:val="Compact"/>
+              <w:jc w:val="right"/>
+            </w:pPr>
+            <w:r>
+              <w:t xml:space="preserve">10</w:t>
+            </w:r>
+          </w:p>
+        </w:tc>
+        <w:tc>
+          <w:tcPr/>
+          <w:p>
+            <w:pPr>
+              <w:pStyle w:val="Compact"/>
+              <w:jc w:val="left"/>
+            </w:pPr>
+            <w:r>
+              <w:t xml:space="preserve">Chaco</w:t>
+            </w:r>
+          </w:p>
+        </w:tc>
+        <w:tc>
+          <w:tcPr/>
+          <w:p>
+            <w:pPr>
+              <w:pStyle w:val="Compact"/>
+              <w:jc w:val="right"/>
+            </w:pPr>
+            <w:r>
+              <w:t xml:space="preserve">70,598</w:t>
+            </w:r>
+          </w:p>
+        </w:tc>
+        <w:tc>
+          <w:tcPr/>
+          <w:p>
+            <w:pPr>
+              <w:pStyle w:val="Compact"/>
+              <w:jc w:val="right"/>
+            </w:pPr>
+            <w:r>
+              <w:t xml:space="preserve">6,418</w:t>
+            </w:r>
+          </w:p>
+        </w:tc>
+        <w:tc>
+          <w:tcPr/>
+          <w:p>
+            <w:pPr>
+              <w:pStyle w:val="Compact"/>
+              <w:jc w:val="right"/>
+            </w:pPr>
+            <w:r>
+              <w:t xml:space="preserve">0.7734</w:t>
+            </w:r>
+          </w:p>
+        </w:tc>
+        <w:tc>
+          <w:tcPr/>
+          <w:p>
+            <w:pPr>
+              <w:pStyle w:val="Compact"/>
+              <w:jc w:val="right"/>
+            </w:pPr>
+            <w:r>
+              <w:t xml:space="preserve">0.2361</w:t>
+            </w:r>
+          </w:p>
+        </w:tc>
+        <w:tc>
+          <w:tcPr/>
+          <w:p>
+            <w:pPr>
+              <w:pStyle w:val="Compact"/>
+              <w:jc w:val="right"/>
+            </w:pPr>
+            <w:r>
+              <w:t xml:space="preserve">126,357</w:t>
+            </w:r>
+          </w:p>
+        </w:tc>
+        <w:tc>
+          <w:tcPr/>
+          <w:p>
+            <w:pPr>
+              <w:pStyle w:val="Compact"/>
+              <w:jc w:val="right"/>
+            </w:pPr>
+            <w:r>
+              <w:t xml:space="preserve">11,487</w:t>
+            </w:r>
+          </w:p>
+        </w:tc>
+        <w:tc>
+          <w:tcPr/>
+          <w:p>
+            <w:pPr>
+              <w:pStyle w:val="Compact"/>
+              <w:jc w:val="right"/>
+            </w:pPr>
+            <w:r>
+              <w:t xml:space="preserve">0.7949</w:t>
+            </w:r>
+          </w:p>
+        </w:tc>
+        <w:tc>
+          <w:tcPr/>
+          <w:p>
+            <w:pPr>
+              <w:pStyle w:val="Compact"/>
+              <w:jc w:val="right"/>
+            </w:pPr>
+            <w:r>
+              <w:t xml:space="preserve">0.2612</w:t>
+            </w:r>
+          </w:p>
+        </w:tc>
+      </w:tr>
+      <w:tr>
+        <w:tc>
+          <w:tcPr/>
+          <w:p>
+            <w:pPr>
+              <w:pStyle w:val="Compact"/>
+              <w:jc w:val="right"/>
+            </w:pPr>
+            <w:r>
+              <w:t xml:space="preserve">35</w:t>
+            </w:r>
+          </w:p>
+        </w:tc>
+        <w:tc>
+          <w:tcPr/>
+          <w:p>
+            <w:pPr>
+              <w:pStyle w:val="Compact"/>
+              <w:jc w:val="right"/>
+            </w:pPr>
+            <w:r>
+              <w:t xml:space="preserve">10</w:t>
+            </w:r>
+          </w:p>
+        </w:tc>
+        <w:tc>
+          <w:tcPr/>
+          <w:p>
+            <w:pPr>
+              <w:pStyle w:val="Compact"/>
+              <w:jc w:val="left"/>
+            </w:pPr>
+            <w:r>
+              <w:t xml:space="preserve">Oriental</w:t>
+            </w:r>
+          </w:p>
+        </w:tc>
+        <w:tc>
+          <w:tcPr/>
+          <w:p>
+            <w:pPr>
+              <w:pStyle w:val="Compact"/>
+              <w:jc w:val="right"/>
+            </w:pPr>
+            <w:r>
+              <w:t xml:space="preserve">58,234</w:t>
+            </w:r>
+          </w:p>
+        </w:tc>
+        <w:tc>
+          <w:tcPr/>
+          <w:p>
+            <w:pPr>
+              <w:pStyle w:val="Compact"/>
+              <w:jc w:val="right"/>
+            </w:pPr>
+            <w:r>
+              <w:t xml:space="preserve">5,294</w:t>
+            </w:r>
+          </w:p>
+        </w:tc>
+        <w:tc>
+          <w:tcPr/>
+          <w:p>
+            <w:pPr>
+              <w:pStyle w:val="Compact"/>
+              <w:jc w:val="right"/>
+            </w:pPr>
+            <w:r>
+              <w:t xml:space="preserve">0.7634</w:t>
+            </w:r>
+          </w:p>
+        </w:tc>
+        <w:tc>
+          <w:tcPr/>
+          <w:p>
+            <w:pPr>
+              <w:pStyle w:val="Compact"/>
+              <w:jc w:val="right"/>
+            </w:pPr>
+            <w:r>
+              <w:t xml:space="preserve">0.2445</w:t>
+            </w:r>
+          </w:p>
+        </w:tc>
+        <w:tc>
+          <w:tcPr/>
+          <w:p>
+            <w:pPr>
+              <w:pStyle w:val="Compact"/>
+              <w:jc w:val="right"/>
+            </w:pPr>
+            <w:r>
+              <w:t xml:space="preserve">125,510</w:t>
+            </w:r>
+          </w:p>
+        </w:tc>
+        <w:tc>
+          <w:tcPr/>
+          <w:p>
+            <w:pPr>
+              <w:pStyle w:val="Compact"/>
+              <w:jc w:val="right"/>
+            </w:pPr>
+            <w:r>
+              <w:t xml:space="preserve">11,410</w:t>
+            </w:r>
+          </w:p>
+        </w:tc>
+        <w:tc>
+          <w:tcPr/>
+          <w:p>
+            <w:pPr>
+              <w:pStyle w:val="Compact"/>
+              <w:jc w:val="right"/>
+            </w:pPr>
+            <w:r>
+              <w:t xml:space="preserve">0.7523</w:t>
+            </w:r>
+          </w:p>
+        </w:tc>
+        <w:tc>
+          <w:tcPr/>
+          <w:p>
+            <w:pPr>
+              <w:pStyle w:val="Compact"/>
+              <w:jc w:val="right"/>
+            </w:pPr>
+            <w:r>
+              <w:t xml:space="preserve">0.2406</w:t>
+            </w:r>
+          </w:p>
+        </w:tc>
+      </w:tr>
+      <w:tr>
+        <w:tc>
+          <w:tcPr/>
+          <w:p>
+            <w:pPr>
+              <w:pStyle w:val="Compact"/>
+              <w:jc w:val="right"/>
+            </w:pPr>
+            <w:r>
+              <w:t xml:space="preserve">35</w:t>
+            </w:r>
+          </w:p>
+        </w:tc>
+        <w:tc>
+          <w:tcPr/>
+          <w:p>
+            <w:pPr>
+              <w:pStyle w:val="Compact"/>
+              <w:jc w:val="right"/>
+            </w:pPr>
+            <w:r>
+              <w:t xml:space="preserve">14</w:t>
+            </w:r>
+          </w:p>
+        </w:tc>
+        <w:tc>
+          <w:tcPr/>
+          <w:p>
+            <w:pPr>
+              <w:pStyle w:val="Compact"/>
+              <w:jc w:val="left"/>
+            </w:pPr>
+            <w:r>
+              <w:t xml:space="preserve">Chaco</w:t>
+            </w:r>
+          </w:p>
+        </w:tc>
+        <w:tc>
+          <w:tcPr/>
+          <w:p>
+            <w:pPr>
+              <w:pStyle w:val="Compact"/>
+              <w:jc w:val="right"/>
+            </w:pPr>
+            <w:r>
+              <w:t xml:space="preserve">68,420</w:t>
+            </w:r>
+          </w:p>
+        </w:tc>
+        <w:tc>
+          <w:tcPr/>
+          <w:p>
+            <w:pPr>
+              <w:pStyle w:val="Compact"/>
+              <w:jc w:val="right"/>
+            </w:pPr>
+            <w:r>
+              <w:t xml:space="preserve">6,220</w:t>
+            </w:r>
+          </w:p>
+        </w:tc>
+        <w:tc>
+          <w:tcPr/>
+          <w:p>
+            <w:pPr>
+              <w:pStyle w:val="Compact"/>
+              <w:jc w:val="right"/>
+            </w:pPr>
+            <w:r>
+              <w:t xml:space="preserve">0.7710</w:t>
+            </w:r>
+          </w:p>
+        </w:tc>
+        <w:tc>
+          <w:tcPr/>
+          <w:p>
+            <w:pPr>
+              <w:pStyle w:val="Compact"/>
+              <w:jc w:val="right"/>
+            </w:pPr>
+            <w:r>
+              <w:t xml:space="preserve">0.2342</w:t>
+            </w:r>
+          </w:p>
+        </w:tc>
+        <w:tc>
+          <w:tcPr/>
+          <w:p>
+            <w:pPr>
+              <w:pStyle w:val="Compact"/>
+              <w:jc w:val="right"/>
+            </w:pPr>
+            <w:r>
+              <w:t xml:space="preserve">122,386</w:t>
+            </w:r>
+          </w:p>
+        </w:tc>
+        <w:tc>
+          <w:tcPr/>
+          <w:p>
+            <w:pPr>
+              <w:pStyle w:val="Compact"/>
+              <w:jc w:val="right"/>
+            </w:pPr>
+            <w:r>
+              <w:t xml:space="preserve">11,126</w:t>
+            </w:r>
+          </w:p>
+        </w:tc>
+        <w:tc>
+          <w:tcPr/>
+          <w:p>
+            <w:pPr>
+              <w:pStyle w:val="Compact"/>
+              <w:jc w:val="right"/>
+            </w:pPr>
+            <w:r>
+              <w:t xml:space="preserve">0.7936</w:t>
+            </w:r>
+          </w:p>
+        </w:tc>
+        <w:tc>
+          <w:tcPr/>
+          <w:p>
+            <w:pPr>
+              <w:pStyle w:val="Compact"/>
+              <w:jc w:val="right"/>
+            </w:pPr>
+            <w:r>
+              <w:t xml:space="preserve">0.2548</w:t>
+            </w:r>
+          </w:p>
+        </w:tc>
+      </w:tr>
+      <w:tr>
+        <w:tc>
+          <w:tcPr/>
+          <w:p>
+            <w:pPr>
+              <w:pStyle w:val="Compact"/>
+              <w:jc w:val="right"/>
+            </w:pPr>
+            <w:r>
+              <w:t xml:space="preserve">35</w:t>
+            </w:r>
+          </w:p>
+        </w:tc>
+        <w:tc>
+          <w:tcPr/>
+          <w:p>
+            <w:pPr>
+              <w:pStyle w:val="Compact"/>
+              <w:jc w:val="right"/>
+            </w:pPr>
+            <w:r>
+              <w:t xml:space="preserve">14</w:t>
+            </w:r>
+          </w:p>
+        </w:tc>
+        <w:tc>
+          <w:tcPr/>
+          <w:p>
+            <w:pPr>
+              <w:pStyle w:val="Compact"/>
+              <w:jc w:val="left"/>
+            </w:pPr>
+            <w:r>
+              <w:t xml:space="preserve">Oriental</w:t>
+            </w:r>
+          </w:p>
+        </w:tc>
+        <w:tc>
+          <w:tcPr/>
+          <w:p>
+            <w:pPr>
+              <w:pStyle w:val="Compact"/>
+              <w:jc w:val="right"/>
+            </w:pPr>
+            <w:r>
+              <w:t xml:space="preserve">57,068</w:t>
+            </w:r>
+          </w:p>
+        </w:tc>
+        <w:tc>
+          <w:tcPr/>
+          <w:p>
+            <w:pPr>
+              <w:pStyle w:val="Compact"/>
+              <w:jc w:val="right"/>
+            </w:pPr>
+            <w:r>
+              <w:t xml:space="preserve">5,188</w:t>
+            </w:r>
+          </w:p>
+        </w:tc>
+        <w:tc>
+          <w:tcPr/>
+          <w:p>
+            <w:pPr>
+              <w:pStyle w:val="Compact"/>
+              <w:jc w:val="right"/>
+            </w:pPr>
+            <w:r>
+              <w:t xml:space="preserve">0.7616</w:t>
+            </w:r>
+          </w:p>
+        </w:tc>
+        <w:tc>
+          <w:tcPr/>
+          <w:p>
+            <w:pPr>
+              <w:pStyle w:val="Compact"/>
+              <w:jc w:val="right"/>
+            </w:pPr>
+            <w:r>
+              <w:t xml:space="preserve">0.2434</w:t>
+            </w:r>
+          </w:p>
+        </w:tc>
+        <w:tc>
+          <w:tcPr/>
+          <w:p>
+            <w:pPr>
+              <w:pStyle w:val="Compact"/>
+              <w:jc w:val="right"/>
+            </w:pPr>
+            <w:r>
+              <w:t xml:space="preserve">123,068</w:t>
+            </w:r>
+          </w:p>
+        </w:tc>
+        <w:tc>
+          <w:tcPr/>
+          <w:p>
+            <w:pPr>
+              <w:pStyle w:val="Compact"/>
+              <w:jc w:val="right"/>
+            </w:pPr>
+            <w:r>
+              <w:t xml:space="preserve">11,188</w:t>
+            </w:r>
+          </w:p>
+        </w:tc>
+        <w:tc>
+          <w:tcPr/>
+          <w:p>
+            <w:pPr>
+              <w:pStyle w:val="Compact"/>
+              <w:jc w:val="right"/>
+            </w:pPr>
+            <w:r>
+              <w:t xml:space="preserve">0.7499</w:t>
+            </w:r>
+          </w:p>
+        </w:tc>
+        <w:tc>
+          <w:tcPr/>
+          <w:p>
+            <w:pPr>
+              <w:pStyle w:val="Compact"/>
+              <w:jc w:val="right"/>
+            </w:pPr>
+            <w:r>
+              <w:t xml:space="preserve">0.2376</w:t>
+            </w:r>
+          </w:p>
+        </w:tc>
+      </w:tr>
+    </w:tbl>
+    <w:p>
+      <w:pPr>
+        <w:pStyle w:val="BodyText"/>
+      </w:pPr>
+      <w:r>
+        <w:t xml:space="preserve">The full table with M1, M2 and the gated policy is in</w:t>
+      </w:r>
+      <w:r>
+        <w:t xml:space="preserve"> </w:t>
+      </w:r>
+      <w:r>
+        <w:rPr>
+          <w:rStyle w:val="VerbatimChar"/>
+        </w:rPr>
+        <w:t xml:space="preserve">tablas/tablaS20_sensibilidad_d2.csv</w:t>
+      </w:r>
+      <w:r>
+        <w:t xml:space="preserve">. The 25 km/10 d row reproduces the same sample and features as the main partitions; its small difference from Table 10 reflects retraining inside this sensitivity harness, not a different target or sample. M3 beat M2 in all 18 region-by-evaluation comparisons (ΔROC +0.004 to +0.016). The 7-day window had the highest ROC-AUC in every region × radius pair, and the radius effect was small: 35 km was slightly better in Chaco and 25 km in Oriental. The ranking and the D2 conclusion are stable.</w:t>
       </w:r>
     </w:p>
     <w:bookmarkEnd w:id="24"/>

</xml_diff>

<commit_message>
release: prepara v2.0.1 con DOI Zenodo y assets
</commit_message>
<xml_diff>
--- a/entregables/material_suplementario.docx
+++ b/entregables/material_suplementario.docx
@@ -23,7 +23,7 @@
         <w:pStyle w:val="Date"/>
       </w:pPr>
       <w:r>
-        <w:t xml:space="preserve">2026-10-27</w:t>
+        <w:t xml:space="preserve">2026-10-28</w:t>
       </w:r>
     </w:p>
     <w:p>
@@ -149,7 +149,7 @@
         </w:r>
       </w:hyperlink>
       <w:r>
-        <w:t xml:space="preserve">; GitHub release v2.0.0).</w:t>
+        <w:t xml:space="preserve">; GitHub release v2.0.1).</w:t>
       </w:r>
       <w:r>
         <w:br/>
@@ -165,7 +165,7 @@
         <w:t xml:space="preserve"> </w:t>
       </w:r>
       <w:r>
-        <w:t xml:space="preserve">processed data and test predictions are available in the v2.0.0 GitHub release under CC BY 4.0 and indexed by the data concept DOI</w:t>
+        <w:t xml:space="preserve">processed data and test predictions are available in the v2.0.1 GitHub release under CC BY 4.0 and indexed by the data concept DOI</w:t>
       </w:r>
       <w:r>
         <w:t xml:space="preserve"> </w:t>
@@ -37333,7 +37333,7 @@
         <w:pStyle w:val="FirstParagraph"/>
       </w:pPr>
       <w:r>
-        <w:t xml:space="preserve">Processed data, test predictions, trained models and derived tables are available in the v2.0.0 GitHub release under CC BY 4.0 and indexed by the data concept DOI</w:t>
+        <w:t xml:space="preserve">Processed data, test predictions, trained models and derived tables are available in the v2.0.1 GitHub release under CC BY 4.0 and indexed by the data concept DOI</w:t>
       </w:r>
       <w:r>
         <w:t xml:space="preserve"> </w:t>

</xml_diff>